<commit_message>
Fact-check pass: 4 corrections; anonymous copies; LaTeX/Overleaf project
Fact-check against full abstracts caught four errors, all in Section 3:
- Griffin's LK-99 DFT paper was described as debunking the flat-band picture; it
  argues the opposite. Solo-author paper, now attributed by name.
- Salke et al. were cited as a rebuttal of the Lu-N-H claim; they report agreement
  with the original Tc. Rewritten to show the dispute is open, not closed.
- The 298 K La-Sc-H claim now carries its pressure range and an explicit note that
  it is singular and unreplicated.
- Ajeesh et al. report a NULL result on time-reversal-symmetry breaking in UTe2;
  the text had described it neutrally as 'studied'.

All 30+ quoted numbers re-verified against the corpus; every one matches.
build_anon.py strips YAML author, LaTeX \author and hyperref pdfauthor, verified
with pdfinfo.

Co-Authored-By: Claude Opus 5 <noreply@anthropic.com>
</commit_message>
<xml_diff>
--- a/draft/survey_v1.docx
+++ b/draft/survey_v1.docx
@@ -4554,7 +4554,13 @@
         <w:t xml:space="preserve">)</w:t>
       </w:r>
       <w:r>
-        <w:t xml:space="preserve">, and a claim of 298 K in a ternary La-Sc-H system</w:t>
+        <w:t xml:space="preserve">, and a claim of superconductivity with onset between 271 and 298 K in</w:t>
+      </w:r>
+      <w:r>
+        <w:t xml:space="preserve"> </w:t>
+      </w:r>
+      <w:r>
+        <w:t xml:space="preserve">a La-Sc-H system at 195-266 GPa</w:t>
       </w:r>
       <w:r>
         <w:t xml:space="preserve"> </w:t>
@@ -4574,7 +4580,25 @@
         <w:t xml:space="preserve">)</w:t>
       </w:r>
       <w:r>
-        <w:t xml:space="preserve">.</w:t>
+        <w:t xml:space="preserve">. That last claim is recent, singular</w:t>
+      </w:r>
+      <w:r>
+        <w:t xml:space="preserve"> </w:t>
+      </w:r>
+      <w:r>
+        <w:t xml:space="preserve">and not independently replicated at the time of writing, and the retraction record</w:t>
+      </w:r>
+      <w:r>
+        <w:t xml:space="preserve"> </w:t>
+      </w:r>
+      <w:r>
+        <w:t xml:space="preserve">discussed below is the reason to say so explicitly rather than to quote the number</w:t>
+      </w:r>
+      <w:r>
+        <w:t xml:space="preserve"> </w:t>
+      </w:r>
+      <w:r>
+        <w:t xml:space="preserve">alone.</w:t>
       </w:r>
     </w:p>
     <w:p>
@@ -4622,13 +4646,19 @@
         <w:t xml:space="preserve">)</w:t>
       </w:r>
       <w:r>
-        <w:t xml:space="preserve">, and the Lu-N-H</w:t>
-      </w:r>
-      <w:r>
-        <w:t xml:space="preserve"> </w:t>
-      </w:r>
-      <w:r>
-        <w:t xml:space="preserve">episode</w:t>
+        <w:t xml:space="preserve">, The Lu-N-H episode is</w:t>
+      </w:r>
+      <w:r>
+        <w:t xml:space="preserve"> </w:t>
+      </w:r>
+      <w:r>
+        <w:t xml:space="preserve">still unsettled rather than closed: one group reported resistance measurements in good</w:t>
+      </w:r>
+      <w:r>
+        <w:t xml:space="preserve"> </w:t>
+      </w:r>
+      <w:r>
+        <w:t xml:space="preserve">agreement with the original transition temperature and its pressure dependence</w:t>
       </w:r>
       <w:r>
         <w:t xml:space="preserve"> </w:t>
@@ -4648,16 +4678,19 @@
         <w:t xml:space="preserve">)</w:t>
       </w:r>
       <w:r>
-        <w:t xml:space="preserve"> </w:t>
-      </w:r>
-      <w:r>
-        <w:t xml:space="preserve">drew both experimental and computational rebuttals:</w:t>
-      </w:r>
-      <w:r>
-        <w:t xml:space="preserve"> </w:t>
-      </w:r>
-      <w:r>
-        <w:t xml:space="preserve">first-principles modelling of the plausible parent structures concluded that the</w:t>
+        <w:t xml:space="preserve">, while several others reported no superconductivity in samples</w:t>
+      </w:r>
+      <w:r>
+        <w:t xml:space="preserve"> </w:t>
+      </w:r>
+      <w:r>
+        <w:t xml:space="preserve">they prepared, and first-principles modelling of the plausible parent structures</w:t>
+      </w:r>
+      <w:r>
+        <w:t xml:space="preserve"> </w:t>
+      </w:r>
+      <w:r>
+        <w:t xml:space="preserve">concluded that the</w:t>
       </w:r>
       <w:r>
         <w:t xml:space="preserve"> </w:t>
@@ -5033,19 +5066,25 @@
         <w:t xml:space="preserve">)</w:t>
       </w:r>
       <w:r>
-        <w:t xml:space="preserve">, while electronic-structure work</w:t>
-      </w:r>
-      <w:r>
-        <w:t xml:space="preserve"> </w:t>
-      </w:r>
-      <w:r>
-        <w:t xml:space="preserve">attributed the flat bands to correlated Cu states rather than to a superconducting</w:t>
-      </w:r>
-      <w:r>
-        <w:t xml:space="preserve"> </w:t>
-      </w:r>
-      <w:r>
-        <w:t xml:space="preserve">mechanism</w:t>
+        <w:t xml:space="preserve">. The episode is also a good example</w:t>
+      </w:r>
+      <w:r>
+        <w:t xml:space="preserve"> </w:t>
+      </w:r>
+      <w:r>
+        <w:t xml:space="preserve">of how first-principles work enters a live controversy on both sides: Griffin’s</w:t>
+      </w:r>
+      <w:r>
+        <w:t xml:space="preserve"> </w:t>
+      </w:r>
+      <w:r>
+        <w:t xml:space="preserve">density-functional calculations identified correlated isolated flat bands at the Fermi</w:t>
+      </w:r>
+      <w:r>
+        <w:t xml:space="preserve"> </w:t>
+      </w:r>
+      <w:r>
+        <w:t xml:space="preserve">level, noting these as a signature associated with high transition temperatures</w:t>
       </w:r>
       <w:r>
         <w:t xml:space="preserve"> </w:t>
@@ -5065,7 +5104,13 @@
         <w:t xml:space="preserve">)</w:t>
       </w:r>
       <w:r>
-        <w:t xml:space="preserve">. The replication burst is the most compressed example</w:t>
+        <w:t xml:space="preserve">, which made the compound worth taking seriously even as the</w:t>
+      </w:r>
+      <w:r>
+        <w:t xml:space="preserve"> </w:t>
+      </w:r>
+      <w:r>
+        <w:t xml:space="preserve">crystals were failing to superconduct. The replication burst is the most compressed example</w:t>
       </w:r>
       <w:r>
         <w:t xml:space="preserve"> </w:t>
@@ -5862,13 +5907,7 @@
         <w:t xml:space="preserve"> </w:t>
       </w:r>
       <w:r>
-        <w:t xml:space="preserve">triplet superconductivity and the fate of time-reversal-symmetry breaking are studied</w:t>
-      </w:r>
-      <w:r>
-        <w:t xml:space="preserve"> </w:t>
-      </w:r>
-      <w:r>
-        <w:t xml:space="preserve">in progressively cleaner crystals</w:t>
+        <w:t xml:space="preserve">triplet superconductivity is studied in progressively cleaner crystals</w:t>
       </w:r>
       <w:r>
         <w:t xml:space="preserve"> </w:t>
@@ -5876,55 +5915,73 @@
       <w:r>
         <w:t xml:space="preserve">(</w:t>
       </w:r>
+      <w:hyperlink w:anchor="ref-wu2023enhanced">
+        <w:r>
+          <w:rPr>
+            <w:rStyle w:val="Hyperlink"/>
+          </w:rPr>
+          <w:t xml:space="preserve">Wu et al. 2023</w:t>
+        </w:r>
+      </w:hyperlink>
+      <w:r>
+        <w:t xml:space="preserve">)</w:t>
+      </w:r>
+      <w:r>
+        <w:t xml:space="preserve"> </w:t>
+      </w:r>
+      <w:r>
+        <w:t xml:space="preserve">following the original spin-triplet report</w:t>
+      </w:r>
+      <w:r>
+        <w:t xml:space="preserve"> </w:t>
+      </w:r>
+      <w:r>
+        <w:t xml:space="preserve">(</w:t>
+      </w:r>
+      <w:hyperlink w:anchor="ref-ran2019nearly">
+        <w:r>
+          <w:rPr>
+            <w:rStyle w:val="Hyperlink"/>
+          </w:rPr>
+          <w:t xml:space="preserve">Ran et al. 2019</w:t>
+        </w:r>
+      </w:hyperlink>
+      <w:r>
+        <w:t xml:space="preserve">)</w:t>
+      </w:r>
+      <w:r>
+        <w:t xml:space="preserve">, and</w:t>
+      </w:r>
+      <w:r>
+        <w:t xml:space="preserve"> </w:t>
+      </w:r>
+      <w:r>
+        <w:t xml:space="preserve">where an earlier claim of time-reversal-symmetry breaking did not survive: Kerr</w:t>
+      </w:r>
+      <w:r>
+        <w:t xml:space="preserve"> </w:t>
+      </w:r>
+      <w:r>
+        <w:t xml:space="preserve">measurements across samples grown by two different routes found no evidence for a</w:t>
+      </w:r>
+      <w:r>
+        <w:t xml:space="preserve"> </w:t>
+      </w:r>
+      <w:r>
+        <w:t xml:space="preserve">spontaneous signal</w:t>
+      </w:r>
+      <w:r>
+        <w:t xml:space="preserve"> </w:t>
+      </w:r>
+      <w:r>
+        <w:t xml:space="preserve">(</w:t>
+      </w:r>
       <w:hyperlink w:anchor="ref-ajeesh2023fate">
         <w:r>
           <w:rPr>
             <w:rStyle w:val="Hyperlink"/>
           </w:rPr>
           <w:t xml:space="preserve">Ajeesh et al. 2023</w:t>
-        </w:r>
-      </w:hyperlink>
-      <w:r>
-        <w:t xml:space="preserve">;</w:t>
-      </w:r>
-      <w:r>
-        <w:t xml:space="preserve"> </w:t>
-      </w:r>
-      <w:hyperlink w:anchor="ref-wu2023enhanced">
-        <w:r>
-          <w:rPr>
-            <w:rStyle w:val="Hyperlink"/>
-          </w:rPr>
-          <w:t xml:space="preserve">Wu et al. 2023</w:t>
-        </w:r>
-      </w:hyperlink>
-      <w:r>
-        <w:t xml:space="preserve">)</w:t>
-      </w:r>
-      <w:r>
-        <w:t xml:space="preserve"> </w:t>
-      </w:r>
-      <w:r>
-        <w:t xml:space="preserve">following the</w:t>
-      </w:r>
-      <w:r>
-        <w:t xml:space="preserve"> </w:t>
-      </w:r>
-      <w:r>
-        <w:t xml:space="preserve">original spin-triplet report</w:t>
-      </w:r>
-      <w:r>
-        <w:t xml:space="preserve"> </w:t>
-      </w:r>
-      <w:r>
-        <w:t xml:space="preserve">(</w:t>
-      </w:r>
-      <w:hyperlink w:anchor="ref-ran2019nearly">
-        <w:r>
-          <w:rPr>
-            <w:rStyle w:val="Hyperlink"/>
-          </w:rPr>
-          <w:t xml:space="preserve">Ran et al. 2019</w:t>
         </w:r>
       </w:hyperlink>
       <w:r>
@@ -7640,19 +7697,25 @@
         <w:t xml:space="preserve"> </w:t>
       </w:r>
       <w:r>
-        <w:t xml:space="preserve">The count grows – 13 in</w:t>
-      </w:r>
-      <w:r>
-        <w:t xml:space="preserve"> </w:t>
-      </w:r>
-      <w:r>
-        <w:t xml:space="preserve">2022, 19 in 2023, 22 in 2024, 38 in 2025 – but from a base so low that even a</w:t>
-      </w:r>
-      <w:r>
-        <w:t xml:space="preserve"> </w:t>
-      </w:r>
-      <w:r>
-        <w:t xml:space="preserve">tripling leaves the field’s daily practice essentially untouched. A recent review of</w:t>
+        <w:t xml:space="preserve">The count grows across the four complete</w:t>
+      </w:r>
+      <w:r>
+        <w:t xml:space="preserve"> </w:t>
+      </w:r>
+      <w:r>
+        <w:t xml:space="preserve">calendar years in the window – 13 in 2022, 19 in 2023, 22 in 2024, 38 in 2025 – but</w:t>
+      </w:r>
+      <w:r>
+        <w:t xml:space="preserve"> </w:t>
+      </w:r>
+      <w:r>
+        <w:t xml:space="preserve">from a base so low that even a tripling leaves the field’s daily practice essentially</w:t>
+      </w:r>
+      <w:r>
+        <w:t xml:space="preserve"> </w:t>
+      </w:r>
+      <w:r>
+        <w:t xml:space="preserve">untouched. A recent review of</w:t>
       </w:r>
       <w:r>
         <w:t xml:space="preserve"> </w:t>

</xml_diff>

<commit_message>
Address review: scope the data-availability claim, separate the two kinds of negative result, disclose the mid-pipeline taxonomy revision
- the 'no community convention' claim was an absence claim about practice we did not
  survey; scoped to what the corpus supports
- computed non-superconductors and failed syntheses were reading as one thing; the
  synthesis mode needs the second kind, which is the one that is missing
- Method now states that the task axis lost its sixth value after the first labelling
  round, that the hand labels were remapped, and that the 70.5% rule figure predates
  the revision and is not a like-for-like comparison

Key stability re-verified after the bib regeneration: 100 cited keys, none missing,
no malformed identifiers from the TeX transliteration.

Co-Authored-By: Claude Opus 5 <noreply@anthropic.com>
</commit_message>
<xml_diff>
--- a/draft/survey_v1.docx
+++ b/draft/survey_v1.docx
@@ -2250,13 +2250,109 @@
           <w:b/>
           <w:bCs/>
         </w:rPr>
+        <w:t xml:space="preserve">Taxonomy revision, disclosed.</w:t>
+      </w:r>
+      <w:r>
+        <w:t xml:space="preserve"> </w:t>
+      </w:r>
+      <w:r>
+        <w:t xml:space="preserve">The two agreement figures above are not measured</w:t>
+      </w:r>
+      <w:r>
+        <w:t xml:space="preserve"> </w:t>
+      </w:r>
+      <w:r>
+        <w:t xml:space="preserve">against the same label set. The task axis originally carried a sixth value,</w:t>
+      </w:r>
+      <w:r>
+        <w:t xml:space="preserve"> </w:t>
+      </w:r>
+      <w:r>
+        <w:rPr>
+          <w:rStyle w:val="VerbatimChar"/>
+        </w:rPr>
+        <w:t xml:space="preserve">application</w:t>
+      </w:r>
+      <w:r>
+        <w:t xml:space="preserve">; the first labelling round showed that characterization-versus-</w:t>
+      </w:r>
+      <w:r>
+        <w:t xml:space="preserve"> </w:t>
+      </w:r>
+      <w:r>
+        <w:t xml:space="preserve">application was the dominant disagreement for the keyword rules and for both</w:t>
+      </w:r>
+      <w:r>
+        <w:t xml:space="preserve"> </w:t>
+      </w:r>
+      <w:r>
+        <w:t xml:space="preserve">benchmarked language models alike, which identified the value as conflating mode of</w:t>
+      </w:r>
+      <w:r>
+        <w:t xml:space="preserve"> </w:t>
+      </w:r>
+      <w:r>
+        <w:t xml:space="preserve">work with purpose rather than as a classifier failure. The value was removed, the 146</w:t>
+      </w:r>
+      <w:r>
+        <w:t xml:space="preserve"> </w:t>
+      </w:r>
+      <w:r>
+        <w:t xml:space="preserve">scored hand labels were remapped accordingly, and the models were re-scored against</w:t>
+      </w:r>
+      <w:r>
+        <w:t xml:space="preserve"> </w:t>
+      </w:r>
+      <w:r>
+        <w:t xml:space="preserve">the revised set. The 70.5% rule figure predates that revision and is reported for</w:t>
+      </w:r>
+      <w:r>
+        <w:t xml:space="preserve"> </w:t>
+      </w:r>
+      <w:r>
+        <w:t xml:space="preserve">completeness rather than as a like-for-like comparison. The prompt was also sharpened</w:t>
+      </w:r>
+      <w:r>
+        <w:t xml:space="preserve"> </w:t>
+      </w:r>
+      <w:r>
+        <w:t xml:space="preserve">once, after per-class recall showed synthesis at 55%, by adding explicit</w:t>
+      </w:r>
+      <w:r>
+        <w:t xml:space="preserve"> </w:t>
+      </w:r>
+      <w:r>
+        <w:t xml:space="preserve">synthesis-versus-characterization and discovery-versus-ab-initio boundary rules;</w:t>
+      </w:r>
+      <w:r>
+        <w:t xml:space="preserve"> </w:t>
+      </w:r>
+      <w:r>
+        <w:t xml:space="preserve">the corpus was then relabelled from scratch with the final prompt.</w:t>
+      </w:r>
+    </w:p>
+    <w:p>
+      <w:pPr>
+        <w:pStyle w:val="BodyText"/>
+      </w:pPr>
+      <w:r>
+        <w:rPr>
+          <w:b/>
+          <w:bCs/>
+        </w:rPr>
         <w:t xml:space="preserve">Annotator disclosure.</w:t>
       </w:r>
       <w:r>
         <w:t xml:space="preserve"> </w:t>
       </w:r>
       <w:r>
-        <w:t xml:space="preserve">All hand labels were produced by a single annotator. The</w:t>
+        <w:t xml:space="preserve">All hand labels were produced by a single annotator, in the</w:t>
+      </w:r>
+      <w:r>
+        <w:t xml:space="preserve"> </w:t>
+      </w:r>
+      <w:r>
+        <w:t xml:space="preserve">same working session that built the pipeline. The</w:t>
       </w:r>
       <w:r>
         <w:t xml:space="preserve"> </w:t>
@@ -7178,19 +7274,25 @@
         <w:t xml:space="preserve"> </w:t>
       </w:r>
       <w:r>
-        <w:t xml:space="preserve">are scarce: a database of materials that were tried and did not superconduct is worth</w:t>
-      </w:r>
-      <w:r>
-        <w:t xml:space="preserve"> </w:t>
-      </w:r>
-      <w:r>
-        <w:t xml:space="preserve">as much as one of those that did, and the one large compilation of non-superconductors</w:t>
-      </w:r>
-      <w:r>
-        <w:t xml:space="preserve"> </w:t>
-      </w:r>
-      <w:r>
-        <w:t xml:space="preserve">in this corpus was assembled as a deliberate remedy</w:t>
+        <w:t xml:space="preserve">are scarce, in two distinct senses that are easy to conflate. Computed</w:t>
+      </w:r>
+      <w:r>
+        <w:t xml:space="preserve"> </w:t>
+      </w:r>
+      <w:r>
+        <w:t xml:space="preserve">non-superconductors can be generated in bulk, and the one large compilation in this</w:t>
+      </w:r>
+      <w:r>
+        <w:t xml:space="preserve"> </w:t>
+      </w:r>
+      <w:r>
+        <w:t xml:space="preserve">corpus – 53,196 entries – was assembled as a deliberate remedy for classifier</w:t>
+      </w:r>
+      <w:r>
+        <w:t xml:space="preserve"> </w:t>
+      </w:r>
+      <w:r>
+        <w:t xml:space="preserve">training</w:t>
       </w:r>
       <w:r>
         <w:t xml:space="preserve"> </w:t>
@@ -7210,7 +7312,55 @@
         <w:t xml:space="preserve">)</w:t>
       </w:r>
       <w:r>
-        <w:t xml:space="preserve">. And the labels</w:t>
+        <w:t xml:space="preserve">; the 3DSC dataset likewise includes tested</w:t>
+      </w:r>
+      <w:r>
+        <w:t xml:space="preserve"> </w:t>
+      </w:r>
+      <w:r>
+        <w:t xml:space="preserve">non-superconductors</w:t>
+      </w:r>
+      <w:r>
+        <w:t xml:space="preserve"> </w:t>
+      </w:r>
+      <w:r>
+        <w:t xml:space="preserve">(</w:t>
+      </w:r>
+      <w:hyperlink w:anchor="ref-sommer20223dsc">
+        <w:r>
+          <w:rPr>
+            <w:rStyle w:val="Hyperlink"/>
+          </w:rPr>
+          <w:t xml:space="preserve">Sommer et al. 2022</w:t>
+        </w:r>
+      </w:hyperlink>
+      <w:r>
+        <w:t xml:space="preserve">)</w:t>
+      </w:r>
+      <w:r>
+        <w:t xml:space="preserve">. Experimentally</w:t>
+      </w:r>
+      <w:r>
+        <w:t xml:space="preserve"> </w:t>
+      </w:r>
+      <w:r>
+        <w:rPr>
+          <w:i/>
+          <w:iCs/>
+        </w:rPr>
+        <w:t xml:space="preserve">attempted and failed</w:t>
+      </w:r>
+      <w:r>
+        <w:t xml:space="preserve"> </w:t>
+      </w:r>
+      <w:r>
+        <w:t xml:space="preserve">syntheses are a different and almost entirely missing record, and it is that second</w:t>
+      </w:r>
+      <w:r>
+        <w:t xml:space="preserve"> </w:t>
+      </w:r>
+      <w:r>
+        <w:t xml:space="preserve">kind the synthesis mode needs. And the labels</w:t>
       </w:r>
       <w:r>
         <w:t xml:space="preserve"> </w:t>
@@ -7517,19 +7667,43 @@
         <w:t xml:space="preserve"> </w:t>
       </w:r>
       <w:r>
-        <w:t xml:space="preserve">spectra are rendered as figures in PDFs; per-group formats are undocumented;</w:t>
-      </w:r>
-      <w:r>
-        <w:t xml:space="preserve"> </w:t>
-      </w:r>
-      <w:r>
-        <w:t xml:space="preserve">supplementary files lack schemas; and there is no community convention for releasing</w:t>
-      </w:r>
-      <w:r>
-        <w:t xml:space="preserve"> </w:t>
-      </w:r>
-      <w:r>
-        <w:t xml:space="preserve">an ARPES cut or an STM map as an array with its acquisition parameters. Where such</w:t>
+        <w:t xml:space="preserve">spectra are rendered as figures in PDFs, per-group formats are undocumented, and</w:t>
+      </w:r>
+      <w:r>
+        <w:t xml:space="preserve"> </w:t>
+      </w:r>
+      <w:r>
+        <w:t xml:space="preserve">supplementary files lack schemas. We did not survey data-availability practice</w:t>
+      </w:r>
+      <w:r>
+        <w:t xml:space="preserve"> </w:t>
+      </w:r>
+      <w:r>
+        <w:t xml:space="preserve">directly, so we state the weaker claim this corpus supports: among the</w:t>
+      </w:r>
+      <w:r>
+        <w:t xml:space="preserve"> </w:t>
+      </w:r>
+      <w:r>
+        <w:t xml:space="preserve">characterization papers read for this survey we encountered no shared convention for</w:t>
+      </w:r>
+      <w:r>
+        <w:t xml:space="preserve"> </w:t>
+      </w:r>
+      <w:r>
+        <w:t xml:space="preserve">releasing an ARPES cut or an STM map as an array with its acquisition parameters, and</w:t>
+      </w:r>
+      <w:r>
+        <w:t xml:space="preserve"> </w:t>
+      </w:r>
+      <w:r>
+        <w:t xml:space="preserve">no repository playing the role that structural databases play for computed materials.</w:t>
+      </w:r>
+      <w:r>
+        <w:t xml:space="preserve"> </w:t>
+      </w:r>
+      <w:r>
+        <w:t xml:space="preserve">Where such</w:t>
       </w:r>
       <w:r>
         <w:t xml:space="preserve"> </w:t>

</xml_diff>

<commit_message>
Data availability points at the released repository
Co-Authored-By: Claude Opus 5 <noreply@anthropic.com>
</commit_message>
<xml_diff>
--- a/draft/survey_v1.docx
+++ b/draft/survey_v1.docx
@@ -13211,7 +13211,7 @@
       </w:r>
     </w:p>
     <w:bookmarkEnd w:id="72"/>
-    <w:bookmarkStart w:id="73" w:name="data-availability"/>
+    <w:bookmarkStart w:id="74" w:name="data-availability"/>
     <w:p>
       <w:pPr>
         <w:pStyle w:val="Heading1"/>
@@ -13231,7 +13231,27 @@
         <w:t xml:space="preserve"> </w:t>
       </w:r>
       <w:r>
-        <w:t xml:space="preserve">released with this manuscript. The archive contains the frozen seed harvest</w:t>
+        <w:t xml:space="preserve">released at</w:t>
+      </w:r>
+      <w:r>
+        <w:t xml:space="preserve"> </w:t>
+      </w:r>
+      <w:hyperlink r:id="rId73">
+        <w:r>
+          <w:rPr>
+            <w:rStyle w:val="Hyperlink"/>
+          </w:rPr>
+          <w:t xml:space="preserve">https://github.com/deepgrounding/superconductivity-ai-survey</w:t>
+        </w:r>
+      </w:hyperlink>
+      <w:r>
+        <w:t xml:space="preserve">. The</w:t>
+      </w:r>
+      <w:r>
+        <w:t xml:space="preserve"> </w:t>
+      </w:r>
+      <w:r>
+        <w:t xml:space="preserve">repository contains the frozen seed harvest</w:t>
       </w:r>
       <w:r>
         <w:t xml:space="preserve"> </w:t>
@@ -13318,8 +13338,8 @@
         <w:t xml:space="preserve">separately.</w:t>
       </w:r>
     </w:p>
-    <w:bookmarkEnd w:id="73"/>
-    <w:bookmarkStart w:id="293" w:name="X4478b5228bfecee8b22f08b71c1692fae0f8ddc"/>
+    <w:bookmarkEnd w:id="74"/>
+    <w:bookmarkStart w:id="294" w:name="X4478b5228bfecee8b22f08b71c1692fae0f8ddc"/>
     <w:p>
       <w:pPr>
         <w:pStyle w:val="Heading1"/>
@@ -13897,8 +13917,8 @@
         </w:tc>
       </w:tr>
     </w:tbl>
-    <w:bookmarkStart w:id="292" w:name="refs"/>
-    <w:bookmarkStart w:id="75" w:name="ref-aasen2025roadmap"/>
+    <w:bookmarkStart w:id="293" w:name="refs"/>
+    <w:bookmarkStart w:id="76" w:name="ref-aasen2025roadmap"/>
     <w:p>
       <w:pPr>
         <w:pStyle w:val="Bibliography"/>
@@ -13922,7 +13942,7 @@
       <w:r>
         <w:t xml:space="preserve"> </w:t>
       </w:r>
-      <w:hyperlink r:id="rId74">
+      <w:hyperlink r:id="rId75">
         <w:r>
           <w:rPr>
             <w:rStyle w:val="Hyperlink"/>
@@ -13934,8 +13954,8 @@
         <w:t xml:space="preserve">.</w:t>
       </w:r>
     </w:p>
-    <w:bookmarkEnd w:id="75"/>
-    <w:bookmarkStart w:id="77" w:name="ref-adiga2025accelerating"/>
+    <w:bookmarkEnd w:id="76"/>
+    <w:bookmarkStart w:id="78" w:name="ref-adiga2025accelerating"/>
     <w:p>
       <w:pPr>
         <w:pStyle w:val="Bibliography"/>
@@ -13965,7 +13985,7 @@
       <w:r>
         <w:t xml:space="preserve"> </w:t>
       </w:r>
-      <w:hyperlink r:id="rId76">
+      <w:hyperlink r:id="rId77">
         <w:r>
           <w:rPr>
             <w:rStyle w:val="Hyperlink"/>
@@ -13977,8 +13997,8 @@
         <w:t xml:space="preserve">.</w:t>
       </w:r>
     </w:p>
-    <w:bookmarkEnd w:id="77"/>
-    <w:bookmarkStart w:id="79" w:name="ref-ajeesh2023fate"/>
+    <w:bookmarkEnd w:id="78"/>
+    <w:bookmarkStart w:id="80" w:name="ref-ajeesh2023fate"/>
     <w:p>
       <w:pPr>
         <w:pStyle w:val="Bibliography"/>
@@ -14016,7 +14036,7 @@
       <w:r>
         <w:t xml:space="preserve"> </w:t>
       </w:r>
-      <w:hyperlink r:id="rId78">
+      <w:hyperlink r:id="rId79">
         <w:r>
           <w:rPr>
             <w:rStyle w:val="Hyperlink"/>
@@ -14028,8 +14048,8 @@
         <w:t xml:space="preserve">.</w:t>
       </w:r>
     </w:p>
-    <w:bookmarkEnd w:id="79"/>
-    <w:bookmarkStart w:id="81" w:name="ref-anthonypetersen2022stress"/>
+    <w:bookmarkEnd w:id="80"/>
+    <w:bookmarkStart w:id="82" w:name="ref-anthonypetersen2022stress"/>
     <w:p>
       <w:pPr>
         <w:pStyle w:val="Bibliography"/>
@@ -14059,7 +14079,7 @@
       <w:r>
         <w:t xml:space="preserve"> </w:t>
       </w:r>
-      <w:hyperlink r:id="rId80">
+      <w:hyperlink r:id="rId81">
         <w:r>
           <w:rPr>
             <w:rStyle w:val="Hyperlink"/>
@@ -14071,8 +14091,8 @@
         <w:t xml:space="preserve">.</w:t>
       </w:r>
     </w:p>
-    <w:bookmarkEnd w:id="81"/>
-    <w:bookmarkStart w:id="83" w:name="ref-anthropic2026mhs"/>
+    <w:bookmarkEnd w:id="82"/>
+    <w:bookmarkStart w:id="84" w:name="ref-anthropic2026mhs"/>
     <w:p>
       <w:pPr>
         <w:pStyle w:val="Bibliography"/>
@@ -14096,7 +14116,7 @@
       <w:r>
         <w:t xml:space="preserve"> </w:t>
       </w:r>
-      <w:hyperlink r:id="rId82">
+      <w:hyperlink r:id="rId83">
         <w:r>
           <w:rPr>
             <w:rStyle w:val="Hyperlink"/>
@@ -14108,8 +14128,8 @@
         <w:t xml:space="preserve">.</w:t>
       </w:r>
     </w:p>
-    <w:bookmarkEnd w:id="83"/>
-    <w:bookmarkStart w:id="85" w:name="ref-bardeen1957theory"/>
+    <w:bookmarkEnd w:id="84"/>
+    <w:bookmarkStart w:id="86" w:name="ref-bardeen1957theory"/>
     <w:p>
       <w:pPr>
         <w:pStyle w:val="Bibliography"/>
@@ -14142,7 +14162,7 @@
       <w:r>
         <w:t xml:space="preserve"> </w:t>
       </w:r>
-      <w:hyperlink r:id="rId84">
+      <w:hyperlink r:id="rId85">
         <w:r>
           <w:rPr>
             <w:rStyle w:val="Hyperlink"/>
@@ -14154,8 +14174,8 @@
         <w:t xml:space="preserve">.</w:t>
       </w:r>
     </w:p>
-    <w:bookmarkEnd w:id="85"/>
-    <w:bookmarkStart w:id="87" w:name="ref-bartl2025evidence"/>
+    <w:bookmarkEnd w:id="86"/>
+    <w:bookmarkStart w:id="88" w:name="ref-bartl2025evidence"/>
     <w:p>
       <w:pPr>
         <w:pStyle w:val="Bibliography"/>
@@ -14193,7 +14213,7 @@
       <w:r>
         <w:t xml:space="preserve"> </w:t>
       </w:r>
-      <w:hyperlink r:id="rId86">
+      <w:hyperlink r:id="rId87">
         <w:r>
           <w:rPr>
             <w:rStyle w:val="Hyperlink"/>
@@ -14205,8 +14225,8 @@
         <w:t xml:space="preserve">.</w:t>
       </w:r>
     </w:p>
-    <w:bookmarkEnd w:id="87"/>
-    <w:bookmarkStart w:id="89" w:name="ref-bednorz1986possible"/>
+    <w:bookmarkEnd w:id="88"/>
+    <w:bookmarkStart w:id="90" w:name="ref-bednorz1986possible"/>
     <w:p>
       <w:pPr>
         <w:pStyle w:val="Bibliography"/>
@@ -14274,7 +14294,7 @@
       <w:r>
         <w:t xml:space="preserve"> </w:t>
       </w:r>
-      <w:hyperlink r:id="rId88">
+      <w:hyperlink r:id="rId89">
         <w:r>
           <w:rPr>
             <w:rStyle w:val="Hyperlink"/>
@@ -14286,8 +14306,8 @@
         <w:t xml:space="preserve">.</w:t>
       </w:r>
     </w:p>
-    <w:bookmarkEnd w:id="89"/>
-    <w:bookmarkStart w:id="91" w:name="ref-bisht2026agentic"/>
+    <w:bookmarkEnd w:id="90"/>
+    <w:bookmarkStart w:id="92" w:name="ref-bisht2026agentic"/>
     <w:p>
       <w:pPr>
         <w:pStyle w:val="Bibliography"/>
@@ -14339,7 +14359,7 @@
       <w:r>
         <w:t xml:space="preserve"> </w:t>
       </w:r>
-      <w:hyperlink r:id="rId90">
+      <w:hyperlink r:id="rId91">
         <w:r>
           <w:rPr>
             <w:rStyle w:val="Hyperlink"/>
@@ -14351,8 +14371,8 @@
         <w:t xml:space="preserve">.</w:t>
       </w:r>
     </w:p>
-    <w:bookmarkEnd w:id="91"/>
-    <w:bookmarkStart w:id="93" w:name="ref-bordin2023crossed"/>
+    <w:bookmarkEnd w:id="92"/>
+    <w:bookmarkStart w:id="94" w:name="ref-bordin2023crossed"/>
     <w:p>
       <w:pPr>
         <w:pStyle w:val="Bibliography"/>
@@ -14382,7 +14402,7 @@
       <w:r>
         <w:t xml:space="preserve"> </w:t>
       </w:r>
-      <w:hyperlink r:id="rId92">
+      <w:hyperlink r:id="rId93">
         <w:r>
           <w:rPr>
             <w:rStyle w:val="Hyperlink"/>
@@ -14394,8 +14414,8 @@
         <w:t xml:space="preserve">.</w:t>
       </w:r>
     </w:p>
-    <w:bookmarkEnd w:id="93"/>
-    <w:bookmarkStart w:id="95" w:name="ref-bragg2025astabench"/>
+    <w:bookmarkEnd w:id="94"/>
+    <w:bookmarkStart w:id="96" w:name="ref-bragg2025astabench"/>
     <w:p>
       <w:pPr>
         <w:pStyle w:val="Bibliography"/>
@@ -14454,7 +14474,7 @@
       <w:r>
         <w:t xml:space="preserve"> </w:t>
       </w:r>
-      <w:hyperlink r:id="rId94">
+      <w:hyperlink r:id="rId95">
         <w:r>
           <w:rPr>
             <w:rStyle w:val="Hyperlink"/>
@@ -14466,8 +14486,8 @@
         <w:t xml:space="preserve">.</w:t>
       </w:r>
     </w:p>
-    <w:bookmarkEnd w:id="95"/>
-    <w:bookmarkStart w:id="97" w:name="ref-cai2023superconductivity"/>
+    <w:bookmarkEnd w:id="96"/>
+    <w:bookmarkStart w:id="98" w:name="ref-cai2023superconductivity"/>
     <w:p>
       <w:pPr>
         <w:pStyle w:val="Bibliography"/>
@@ -14491,7 +14511,7 @@
       <w:r>
         <w:t xml:space="preserve"> </w:t>
       </w:r>
-      <w:hyperlink r:id="rId96">
+      <w:hyperlink r:id="rId97">
         <w:r>
           <w:rPr>
             <w:rStyle w:val="Hyperlink"/>
@@ -14503,8 +14523,8 @@
         <w:t xml:space="preserve">.</w:t>
       </w:r>
     </w:p>
-    <w:bookmarkEnd w:id="97"/>
-    <w:bookmarkStart w:id="99" w:name="ref-cao2018unconventional"/>
+    <w:bookmarkEnd w:id="98"/>
+    <w:bookmarkStart w:id="100" w:name="ref-cao2018unconventional"/>
     <w:p>
       <w:pPr>
         <w:pStyle w:val="Bibliography"/>
@@ -14537,7 +14557,7 @@
       <w:r>
         <w:t xml:space="preserve"> </w:t>
       </w:r>
-      <w:hyperlink r:id="rId98">
+      <w:hyperlink r:id="rId99">
         <w:r>
           <w:rPr>
             <w:rStyle w:val="Hyperlink"/>
@@ -14549,8 +14569,8 @@
         <w:t xml:space="preserve">.</w:t>
       </w:r>
     </w:p>
-    <w:bookmarkEnd w:id="99"/>
-    <w:bookmarkStart w:id="101" w:name="ref-cao2024probing"/>
+    <w:bookmarkEnd w:id="100"/>
+    <w:bookmarkStart w:id="102" w:name="ref-cao2024probing"/>
     <w:p>
       <w:pPr>
         <w:pStyle w:val="Bibliography"/>
@@ -14595,7 +14615,7 @@
       <w:r>
         <w:t xml:space="preserve"> </w:t>
       </w:r>
-      <w:hyperlink r:id="rId100">
+      <w:hyperlink r:id="rId101">
         <w:r>
           <w:rPr>
             <w:rStyle w:val="Hyperlink"/>
@@ -14607,8 +14627,8 @@
         <w:t xml:space="preserve">.</w:t>
       </w:r>
     </w:p>
-    <w:bookmarkEnd w:id="101"/>
-    <w:bookmarkStart w:id="103" w:name="ref-carleo2017solving"/>
+    <w:bookmarkEnd w:id="102"/>
+    <w:bookmarkStart w:id="104" w:name="ref-carleo2017solving"/>
     <w:p>
       <w:pPr>
         <w:pStyle w:val="Bibliography"/>
@@ -14641,7 +14661,7 @@
       <w:r>
         <w:t xml:space="preserve"> </w:t>
       </w:r>
-      <w:hyperlink r:id="rId102">
+      <w:hyperlink r:id="rId103">
         <w:r>
           <w:rPr>
             <w:rStyle w:val="Hyperlink"/>
@@ -14653,8 +14673,8 @@
         <w:t xml:space="preserve">.</w:t>
       </w:r>
     </w:p>
-    <w:bookmarkEnd w:id="103"/>
-    <w:bookmarkStart w:id="105" w:name="ref-cerqueira2024searching"/>
+    <w:bookmarkEnd w:id="104"/>
+    <w:bookmarkStart w:id="106" w:name="ref-cerqueira2024searching"/>
     <w:p>
       <w:pPr>
         <w:pStyle w:val="Bibliography"/>
@@ -14678,7 +14698,7 @@
       <w:r>
         <w:t xml:space="preserve"> </w:t>
       </w:r>
-      <w:hyperlink r:id="rId104">
+      <w:hyperlink r:id="rId105">
         <w:r>
           <w:rPr>
             <w:rStyle w:val="Hyperlink"/>
@@ -14690,8 +14710,8 @@
         <w:t xml:space="preserve">.</w:t>
       </w:r>
     </w:p>
-    <w:bookmarkEnd w:id="105"/>
-    <w:bookmarkStart w:id="107" w:name="ref-cerqueira2023sampling"/>
+    <w:bookmarkEnd w:id="106"/>
+    <w:bookmarkStart w:id="108" w:name="ref-cerqueira2023sampling"/>
     <w:p>
       <w:pPr>
         <w:pStyle w:val="Bibliography"/>
@@ -14715,7 +14735,7 @@
       <w:r>
         <w:t xml:space="preserve"> </w:t>
       </w:r>
-      <w:hyperlink r:id="rId106">
+      <w:hyperlink r:id="rId107">
         <w:r>
           <w:rPr>
             <w:rStyle w:val="Hyperlink"/>
@@ -14727,8 +14747,8 @@
         <w:t xml:space="preserve">.</w:t>
       </w:r>
     </w:p>
-    <w:bookmarkEnd w:id="107"/>
-    <w:bookmarkStart w:id="109" w:name="ref-cheetham2024artificial"/>
+    <w:bookmarkEnd w:id="108"/>
+    <w:bookmarkStart w:id="110" w:name="ref-cheetham2024artificial"/>
     <w:p>
       <w:pPr>
         <w:pStyle w:val="Bibliography"/>
@@ -14779,7 +14799,7 @@
       <w:r>
         <w:t xml:space="preserve"> </w:t>
       </w:r>
-      <w:hyperlink r:id="rId108">
+      <w:hyperlink r:id="rId109">
         <w:r>
           <w:rPr>
             <w:rStyle w:val="Hyperlink"/>
@@ -14791,8 +14811,8 @@
         <w:t xml:space="preserve">.</w:t>
       </w:r>
     </w:p>
-    <w:bookmarkEnd w:id="109"/>
-    <w:bookmarkStart w:id="111" w:name="ref-corbae2025hunds"/>
+    <w:bookmarkEnd w:id="110"/>
+    <w:bookmarkStart w:id="112" w:name="ref-corbae2025hunds"/>
     <w:p>
       <w:pPr>
         <w:pStyle w:val="Bibliography"/>
@@ -14844,7 +14864,7 @@
       <w:r>
         <w:t xml:space="preserve"> </w:t>
       </w:r>
-      <w:hyperlink r:id="rId110">
+      <w:hyperlink r:id="rId111">
         <w:r>
           <w:rPr>
             <w:rStyle w:val="Hyperlink"/>
@@ -14856,8 +14876,8 @@
         <w:t xml:space="preserve">.</w:t>
       </w:r>
     </w:p>
-    <w:bookmarkEnd w:id="111"/>
-    <w:bookmarkStart w:id="113" w:name="ref-dangic2023ab"/>
+    <w:bookmarkEnd w:id="112"/>
+    <w:bookmarkStart w:id="114" w:name="ref-dangic2023ab"/>
     <w:p>
       <w:pPr>
         <w:pStyle w:val="Bibliography"/>
@@ -14881,7 +14901,7 @@
       <w:r>
         <w:t xml:space="preserve"> </w:t>
       </w:r>
-      <w:hyperlink r:id="rId112">
+      <w:hyperlink r:id="rId113">
         <w:r>
           <w:rPr>
             <w:rStyle w:val="Hyperlink"/>
@@ -14893,8 +14913,8 @@
         <w:t xml:space="preserve">.</w:t>
       </w:r>
     </w:p>
-    <w:bookmarkEnd w:id="113"/>
-    <w:bookmarkStart w:id="115" w:name="ref-dasenbrock2023retracted"/>
+    <w:bookmarkEnd w:id="114"/>
+    <w:bookmarkStart w:id="116" w:name="ref-dasenbrock2023retracted"/>
     <w:p>
       <w:pPr>
         <w:pStyle w:val="Bibliography"/>
@@ -14936,7 +14956,7 @@
       <w:r>
         <w:t xml:space="preserve"> </w:t>
       </w:r>
-      <w:hyperlink r:id="rId114">
+      <w:hyperlink r:id="rId115">
         <w:r>
           <w:rPr>
             <w:rStyle w:val="Hyperlink"/>
@@ -14948,8 +14968,8 @@
         <w:t xml:space="preserve">.</w:t>
       </w:r>
     </w:p>
-    <w:bookmarkEnd w:id="115"/>
-    <w:bookmarkStart w:id="117" w:name="ref-deng2022titanium"/>
+    <w:bookmarkEnd w:id="116"/>
+    <w:bookmarkStart w:id="118" w:name="ref-deng2022titanium"/>
     <w:p>
       <w:pPr>
         <w:pStyle w:val="Bibliography"/>
@@ -14973,7 +14993,7 @@
       <w:r>
         <w:t xml:space="preserve"> </w:t>
       </w:r>
-      <w:hyperlink r:id="rId116">
+      <w:hyperlink r:id="rId117">
         <w:r>
           <w:rPr>
             <w:rStyle w:val="Hyperlink"/>
@@ -14985,8 +15005,8 @@
         <w:t xml:space="preserve">.</w:t>
       </w:r>
     </w:p>
-    <w:bookmarkEnd w:id="117"/>
-    <w:bookmarkStart w:id="119" w:name="ref-drimmer2024effect"/>
+    <w:bookmarkEnd w:id="118"/>
+    <w:bookmarkStart w:id="120" w:name="ref-drimmer2024effect"/>
     <w:p>
       <w:pPr>
         <w:pStyle w:val="Bibliography"/>
@@ -15010,7 +15030,7 @@
       <w:r>
         <w:t xml:space="preserve"> </w:t>
       </w:r>
-      <w:hyperlink r:id="rId118">
+      <w:hyperlink r:id="rId119">
         <w:r>
           <w:rPr>
             <w:rStyle w:val="Hyperlink"/>
@@ -15022,8 +15042,8 @@
         <w:t xml:space="preserve">.</w:t>
       </w:r>
     </w:p>
-    <w:bookmarkEnd w:id="119"/>
-    <w:bookmarkStart w:id="121" w:name="ref-drozdov2015conventional"/>
+    <w:bookmarkEnd w:id="120"/>
+    <w:bookmarkStart w:id="122" w:name="ref-drozdov2015conventional"/>
     <w:p>
       <w:pPr>
         <w:pStyle w:val="Bibliography"/>
@@ -15056,7 +15076,7 @@
       <w:r>
         <w:t xml:space="preserve"> </w:t>
       </w:r>
-      <w:hyperlink r:id="rId120">
+      <w:hyperlink r:id="rId121">
         <w:r>
           <w:rPr>
             <w:rStyle w:val="Hyperlink"/>
@@ -15068,8 +15088,8 @@
         <w:t xml:space="preserve">.</w:t>
       </w:r>
     </w:p>
-    <w:bookmarkEnd w:id="121"/>
-    <w:bookmarkStart w:id="123" w:name="ref-drozdov2019superconductivity"/>
+    <w:bookmarkEnd w:id="122"/>
+    <w:bookmarkStart w:id="124" w:name="ref-drozdov2019superconductivity"/>
     <w:p>
       <w:pPr>
         <w:pStyle w:val="Bibliography"/>
@@ -15114,7 +15134,7 @@
       <w:r>
         <w:t xml:space="preserve"> </w:t>
       </w:r>
-      <w:hyperlink r:id="rId122">
+      <w:hyperlink r:id="rId123">
         <w:r>
           <w:rPr>
             <w:rStyle w:val="Hyperlink"/>
@@ -15126,8 +15146,8 @@
         <w:t xml:space="preserve">.</w:t>
       </w:r>
     </w:p>
-    <w:bookmarkEnd w:id="123"/>
-    <w:bookmarkStart w:id="125" w:name="ref-dvir2022realization"/>
+    <w:bookmarkEnd w:id="124"/>
+    <w:bookmarkStart w:id="126" w:name="ref-dvir2022realization"/>
     <w:p>
       <w:pPr>
         <w:pStyle w:val="Bibliography"/>
@@ -15157,7 +15177,7 @@
       <w:r>
         <w:t xml:space="preserve"> </w:t>
       </w:r>
-      <w:hyperlink r:id="rId124">
+      <w:hyperlink r:id="rId125">
         <w:r>
           <w:rPr>
             <w:rStyle w:val="Hyperlink"/>
@@ -15169,8 +15189,8 @@
         <w:t xml:space="preserve">.</w:t>
       </w:r>
     </w:p>
-    <w:bookmarkEnd w:id="125"/>
-    <w:bookmarkStart w:id="127" w:name="ref-fang2023assessing"/>
+    <w:bookmarkEnd w:id="126"/>
+    <w:bookmarkStart w:id="128" w:name="ref-fang2023assessing"/>
     <w:p>
       <w:pPr>
         <w:pStyle w:val="Bibliography"/>
@@ -15200,7 +15220,7 @@
       <w:r>
         <w:t xml:space="preserve"> </w:t>
       </w:r>
-      <w:hyperlink r:id="rId126">
+      <w:hyperlink r:id="rId127">
         <w:r>
           <w:rPr>
             <w:rStyle w:val="Hyperlink"/>
@@ -15212,8 +15232,8 @@
         <w:t xml:space="preserve">.</w:t>
       </w:r>
     </w:p>
-    <w:bookmarkEnd w:id="127"/>
-    <w:bookmarkStart w:id="129" w:name="ref-faroughy2026colliderbench"/>
+    <w:bookmarkEnd w:id="128"/>
+    <w:bookmarkStart w:id="130" w:name="ref-faroughy2026colliderbench"/>
     <w:p>
       <w:pPr>
         <w:pStyle w:val="Bibliography"/>
@@ -15272,7 +15292,7 @@
       <w:r>
         <w:t xml:space="preserve"> </w:t>
       </w:r>
-      <w:hyperlink r:id="rId128">
+      <w:hyperlink r:id="rId129">
         <w:r>
           <w:rPr>
             <w:rStyle w:val="Hyperlink"/>
@@ -15284,8 +15304,8 @@
         <w:t xml:space="preserve">.</w:t>
       </w:r>
     </w:p>
-    <w:bookmarkEnd w:id="129"/>
-    <w:bookmarkStart w:id="131" w:name="ref-gao2025unilabos"/>
+    <w:bookmarkEnd w:id="130"/>
+    <w:bookmarkStart w:id="132" w:name="ref-gao2025unilabos"/>
     <w:p>
       <w:pPr>
         <w:pStyle w:val="Bibliography"/>
@@ -15337,7 +15357,7 @@
       <w:r>
         <w:t xml:space="preserve"> </w:t>
       </w:r>
-      <w:hyperlink r:id="rId130">
+      <w:hyperlink r:id="rId131">
         <w:r>
           <w:rPr>
             <w:rStyle w:val="Hyperlink"/>
@@ -15349,8 +15369,8 @@
         <w:t xml:space="preserve">.</w:t>
       </w:r>
     </w:p>
-    <w:bookmarkEnd w:id="131"/>
-    <w:bookmarkStart w:id="133" w:name="ref-gashmard2025ai"/>
+    <w:bookmarkEnd w:id="132"/>
+    <w:bookmarkStart w:id="134" w:name="ref-gashmard2025ai"/>
     <w:p>
       <w:pPr>
         <w:pStyle w:val="Bibliography"/>
@@ -15381,7 +15401,7 @@
       <w:r>
         <w:t xml:space="preserve"> </w:t>
       </w:r>
-      <w:hyperlink r:id="rId132">
+      <w:hyperlink r:id="rId133">
         <w:r>
           <w:rPr>
             <w:rStyle w:val="Hyperlink"/>
@@ -15393,8 +15413,8 @@
         <w:t xml:space="preserve">.</w:t>
       </w:r>
     </w:p>
-    <w:bookmarkEnd w:id="133"/>
-    <w:bookmarkStart w:id="135" w:name="ref-gaytanvillarreal2026real"/>
+    <w:bookmarkEnd w:id="134"/>
+    <w:bookmarkStart w:id="136" w:name="ref-gaytanvillarreal2026real"/>
     <w:p>
       <w:pPr>
         <w:pStyle w:val="Bibliography"/>
@@ -15418,7 +15438,7 @@
       <w:r>
         <w:t xml:space="preserve"> </w:t>
       </w:r>
-      <w:hyperlink r:id="rId134">
+      <w:hyperlink r:id="rId135">
         <w:r>
           <w:rPr>
             <w:rStyle w:val="Hyperlink"/>
@@ -15430,8 +15450,8 @@
         <w:t xml:space="preserve">.</w:t>
       </w:r>
     </w:p>
-    <w:bookmarkEnd w:id="135"/>
-    <w:bookmarkStart w:id="137" w:name="ref-ge2022charge"/>
+    <w:bookmarkEnd w:id="136"/>
+    <w:bookmarkStart w:id="138" w:name="ref-ge2022charge"/>
     <w:p>
       <w:pPr>
         <w:pStyle w:val="Bibliography"/>
@@ -15461,7 +15481,7 @@
       <w:r>
         <w:t xml:space="preserve"> </w:t>
       </w:r>
-      <w:hyperlink r:id="rId136">
+      <w:hyperlink r:id="rId137">
         <w:r>
           <w:rPr>
             <w:rStyle w:val="Hyperlink"/>
@@ -15473,8 +15493,8 @@
         <w:t xml:space="preserve">.</w:t>
       </w:r>
     </w:p>
-    <w:bookmarkEnd w:id="137"/>
-    <w:bookmarkStart w:id="139" w:name="ref-griffin2023origin"/>
+    <w:bookmarkEnd w:id="138"/>
+    <w:bookmarkStart w:id="140" w:name="ref-griffin2023origin"/>
     <w:p>
       <w:pPr>
         <w:pStyle w:val="Bibliography"/>
@@ -15498,7 +15518,7 @@
       <w:r>
         <w:t xml:space="preserve"> </w:t>
       </w:r>
-      <w:hyperlink r:id="rId138">
+      <w:hyperlink r:id="rId139">
         <w:r>
           <w:rPr>
             <w:rStyle w:val="Hyperlink"/>
@@ -15510,8 +15530,8 @@
         <w:t xml:space="preserve">.</w:t>
       </w:r>
     </w:p>
-    <w:bookmarkEnd w:id="139"/>
-    <w:bookmarkStart w:id="141" w:name="ref-gu2023effective"/>
+    <w:bookmarkEnd w:id="140"/>
+    <w:bookmarkStart w:id="142" w:name="ref-gu2023effective"/>
     <w:p>
       <w:pPr>
         <w:pStyle w:val="Bibliography"/>
@@ -15541,7 +15561,7 @@
       <w:r>
         <w:t xml:space="preserve"> </w:t>
       </w:r>
-      <w:hyperlink r:id="rId140">
+      <w:hyperlink r:id="rId141">
         <w:r>
           <w:rPr>
             <w:rStyle w:val="Hyperlink"/>
@@ -15553,8 +15573,8 @@
         <w:t xml:space="preserve">.</w:t>
       </w:r>
     </w:p>
-    <w:bookmarkEnd w:id="141"/>
-    <w:bookmarkStart w:id="143" w:name="ref-hamidieh2018data"/>
+    <w:bookmarkEnd w:id="142"/>
+    <w:bookmarkStart w:id="144" w:name="ref-hamidieh2018data"/>
     <w:p>
       <w:pPr>
         <w:pStyle w:val="Bibliography"/>
@@ -15587,7 +15607,7 @@
       <w:r>
         <w:t xml:space="preserve"> </w:t>
       </w:r>
-      <w:hyperlink r:id="rId142">
+      <w:hyperlink r:id="rId143">
         <w:r>
           <w:rPr>
             <w:rStyle w:val="Hyperlink"/>
@@ -15599,8 +15619,8 @@
         <w:t xml:space="preserve">.</w:t>
       </w:r>
     </w:p>
-    <w:bookmarkEnd w:id="143"/>
-    <w:bookmarkStart w:id="145" w:name="ref-han2024invdesflow"/>
+    <w:bookmarkEnd w:id="144"/>
+    <w:bookmarkStart w:id="146" w:name="ref-han2024invdesflow"/>
     <w:p>
       <w:pPr>
         <w:pStyle w:val="Bibliography"/>
@@ -15645,7 +15665,7 @@
       <w:r>
         <w:t xml:space="preserve"> </w:t>
       </w:r>
-      <w:hyperlink r:id="rId144">
+      <w:hyperlink r:id="rId145">
         <w:r>
           <w:rPr>
             <w:rStyle w:val="Hyperlink"/>
@@ -15657,8 +15677,8 @@
         <w:t xml:space="preserve">.</w:t>
       </w:r>
     </w:p>
-    <w:bookmarkEnd w:id="145"/>
-    <w:bookmarkStart w:id="147" w:name="ref-holleis2023nematicity"/>
+    <w:bookmarkEnd w:id="146"/>
+    <w:bookmarkStart w:id="148" w:name="ref-holleis2023nematicity"/>
     <w:p>
       <w:pPr>
         <w:pStyle w:val="Bibliography"/>
@@ -15682,7 +15702,7 @@
       <w:r>
         <w:t xml:space="preserve"> </w:t>
       </w:r>
-      <w:hyperlink r:id="rId146">
+      <w:hyperlink r:id="rId147">
         <w:r>
           <w:rPr>
             <w:rStyle w:val="Hyperlink"/>
@@ -15694,8 +15714,8 @@
         <w:t xml:space="preserve">.</w:t>
       </w:r>
     </w:p>
-    <w:bookmarkEnd w:id="147"/>
-    <w:bookmarkStart w:id="149" w:name="ref-hou2025distinct"/>
+    <w:bookmarkEnd w:id="148"/>
+    <w:bookmarkStart w:id="150" w:name="ref-hou2025distinct"/>
     <w:p>
       <w:pPr>
         <w:pStyle w:val="Bibliography"/>
@@ -15768,7 +15788,7 @@
       <w:r>
         <w:t xml:space="preserve"> </w:t>
       </w:r>
-      <w:hyperlink r:id="rId148">
+      <w:hyperlink r:id="rId149">
         <w:r>
           <w:rPr>
             <w:rStyle w:val="Hyperlink"/>
@@ -15780,8 +15800,8 @@
         <w:t xml:space="preserve">.</w:t>
       </w:r>
     </w:p>
-    <w:bookmarkEnd w:id="149"/>
-    <w:bookmarkStart w:id="151" w:name="ref-hu2022coexistence"/>
+    <w:bookmarkEnd w:id="150"/>
+    <w:bookmarkStart w:id="152" w:name="ref-hu2022coexistence"/>
     <w:p>
       <w:pPr>
         <w:pStyle w:val="Bibliography"/>
@@ -15820,7 +15840,7 @@
       <w:r>
         <w:t xml:space="preserve"> </w:t>
       </w:r>
-      <w:hyperlink r:id="rId150">
+      <w:hyperlink r:id="rId151">
         <w:r>
           <w:rPr>
             <w:rStyle w:val="Hyperlink"/>
@@ -15832,8 +15852,8 @@
         <w:t xml:space="preserve">.</w:t>
       </w:r>
     </w:p>
-    <w:bookmarkEnd w:id="151"/>
-    <w:bookmarkStart w:id="153" w:name="ref-iguchi2023observation"/>
+    <w:bookmarkEnd w:id="152"/>
+    <w:bookmarkStart w:id="154" w:name="ref-iguchi2023observation"/>
     <w:p>
       <w:pPr>
         <w:pStyle w:val="Bibliography"/>
@@ -15863,7 +15883,7 @@
       <w:r>
         <w:t xml:space="preserve"> </w:t>
       </w:r>
-      <w:hyperlink r:id="rId152">
+      <w:hyperlink r:id="rId153">
         <w:r>
           <w:rPr>
             <w:rStyle w:val="Hyperlink"/>
@@ -15875,8 +15895,8 @@
         <w:t xml:space="preserve">.</w:t>
       </w:r>
     </w:p>
-    <w:bookmarkEnd w:id="153"/>
-    <w:bookmarkStart w:id="155" w:name="ref-itani2025large"/>
+    <w:bookmarkEnd w:id="154"/>
+    <w:bookmarkStart w:id="156" w:name="ref-itani2025large"/>
     <w:p>
       <w:pPr>
         <w:pStyle w:val="Bibliography"/>
@@ -15900,7 +15920,7 @@
       <w:r>
         <w:t xml:space="preserve"> </w:t>
       </w:r>
-      <w:hyperlink r:id="rId154">
+      <w:hyperlink r:id="rId155">
         <w:r>
           <w:rPr>
             <w:rStyle w:val="Hyperlink"/>
@@ -15912,8 +15932,8 @@
         <w:t xml:space="preserve">.</w:t>
       </w:r>
     </w:p>
-    <w:bookmarkEnd w:id="155"/>
-    <w:bookmarkStart w:id="157" w:name="ref-jiang2021kagome"/>
+    <w:bookmarkEnd w:id="156"/>
+    <w:bookmarkStart w:id="158" w:name="ref-jiang2021kagome"/>
     <w:p>
       <w:pPr>
         <w:pStyle w:val="Bibliography"/>
@@ -15952,7 +15972,7 @@
       <w:r>
         <w:t xml:space="preserve"> </w:t>
       </w:r>
-      <w:hyperlink r:id="rId156">
+      <w:hyperlink r:id="rId157">
         <w:r>
           <w:rPr>
             <w:rStyle w:val="Hyperlink"/>
@@ -15964,8 +15984,8 @@
         <w:t xml:space="preserve">.</w:t>
       </w:r>
     </w:p>
-    <w:bookmarkEnd w:id="157"/>
-    <w:bookmarkStart w:id="159" w:name="ref-kamihara2008iron"/>
+    <w:bookmarkEnd w:id="158"/>
+    <w:bookmarkStart w:id="160" w:name="ref-kamihara2008iron"/>
     <w:p>
       <w:pPr>
         <w:pStyle w:val="Bibliography"/>
@@ -16110,7 +16130,7 @@
       <w:r>
         <w:t xml:space="preserve"> </w:t>
       </w:r>
-      <w:hyperlink r:id="rId158">
+      <w:hyperlink r:id="rId159">
         <w:r>
           <w:rPr>
             <w:rStyle w:val="Hyperlink"/>
@@ -16122,8 +16142,8 @@
         <w:t xml:space="preserve">.</w:t>
       </w:r>
     </w:p>
-    <w:bookmarkEnd w:id="159"/>
-    <w:bookmarkStart w:id="161" w:name="ref-kang2022charge"/>
+    <w:bookmarkEnd w:id="160"/>
+    <w:bookmarkStart w:id="162" w:name="ref-kang2022charge"/>
     <w:p>
       <w:pPr>
         <w:pStyle w:val="Bibliography"/>
@@ -16153,7 +16173,7 @@
       <w:r>
         <w:t xml:space="preserve"> </w:t>
       </w:r>
-      <w:hyperlink r:id="rId160">
+      <w:hyperlink r:id="rId161">
         <w:r>
           <w:rPr>
             <w:rStyle w:val="Hyperlink"/>
@@ -16165,8 +16185,8 @@
         <w:t xml:space="preserve">.</w:t>
       </w:r>
     </w:p>
-    <w:bookmarkEnd w:id="161"/>
-    <w:bookmarkStart w:id="163" w:name="ref-kochan2023phenomenological"/>
+    <w:bookmarkEnd w:id="162"/>
+    <w:bookmarkStart w:id="164" w:name="ref-kochan2023phenomenological"/>
     <w:p>
       <w:pPr>
         <w:pStyle w:val="Bibliography"/>
@@ -16190,7 +16210,7 @@
       <w:r>
         <w:t xml:space="preserve"> </w:t>
       </w:r>
-      <w:hyperlink r:id="rId162">
+      <w:hyperlink r:id="rId163">
         <w:r>
           <w:rPr>
             <w:rStyle w:val="Hyperlink"/>
@@ -16202,8 +16222,8 @@
         <w:t xml:space="preserve">.</w:t>
       </w:r>
     </w:p>
-    <w:bookmarkEnd w:id="163"/>
-    <w:bookmarkStart w:id="165" w:name="ref-kusne2026managing"/>
+    <w:bookmarkEnd w:id="164"/>
+    <w:bookmarkStart w:id="166" w:name="ref-kusne2026managing"/>
     <w:p>
       <w:pPr>
         <w:pStyle w:val="Bibliography"/>
@@ -16248,7 +16268,7 @@
       <w:r>
         <w:t xml:space="preserve"> </w:t>
       </w:r>
-      <w:hyperlink r:id="rId164">
+      <w:hyperlink r:id="rId165">
         <w:r>
           <w:rPr>
             <w:rStyle w:val="Hyperlink"/>
@@ -16260,8 +16280,8 @@
         <w:t xml:space="preserve">.</w:t>
       </w:r>
     </w:p>
-    <w:bookmarkEnd w:id="165"/>
-    <w:bookmarkStart w:id="167" w:name="ref-lange2024simulating"/>
+    <w:bookmarkEnd w:id="166"/>
+    <w:bookmarkStart w:id="168" w:name="ref-lange2024simulating"/>
     <w:p>
       <w:pPr>
         <w:pStyle w:val="Bibliography"/>
@@ -16285,7 +16305,7 @@
       <w:r>
         <w:t xml:space="preserve"> </w:t>
       </w:r>
-      <w:hyperlink r:id="rId166">
+      <w:hyperlink r:id="rId167">
         <w:r>
           <w:rPr>
             <w:rStyle w:val="Hyperlink"/>
@@ -16297,8 +16317,8 @@
         <w:t xml:space="preserve">.</w:t>
       </w:r>
     </w:p>
-    <w:bookmarkEnd w:id="167"/>
-    <w:bookmarkStart w:id="169" w:name="ref-lau2023topological"/>
+    <w:bookmarkEnd w:id="168"/>
+    <w:bookmarkStart w:id="170" w:name="ref-lau2023topological"/>
     <w:p>
       <w:pPr>
         <w:pStyle w:val="Bibliography"/>
@@ -16328,7 +16348,7 @@
       <w:r>
         <w:t xml:space="preserve"> </w:t>
       </w:r>
-      <w:hyperlink r:id="rId168">
+      <w:hyperlink r:id="rId169">
         <w:r>
           <w:rPr>
             <w:rStyle w:val="Hyperlink"/>
@@ -16340,8 +16360,8 @@
         <w:t xml:space="preserve">.</w:t>
       </w:r>
     </w:p>
-    <w:bookmarkEnd w:id="169"/>
-    <w:bookmarkStart w:id="171" w:name="ref-lee2026toward"/>
+    <w:bookmarkEnd w:id="170"/>
+    <w:bookmarkStart w:id="172" w:name="ref-lee2026toward"/>
     <w:p>
       <w:pPr>
         <w:pStyle w:val="Bibliography"/>
@@ -16374,7 +16394,7 @@
       <w:r>
         <w:t xml:space="preserve"> </w:t>
       </w:r>
-      <w:hyperlink r:id="rId170">
+      <w:hyperlink r:id="rId171">
         <w:r>
           <w:rPr>
             <w:rStyle w:val="Hyperlink"/>
@@ -16386,8 +16406,8 @@
         <w:t xml:space="preserve">.</w:t>
       </w:r>
     </w:p>
-    <w:bookmarkEnd w:id="171"/>
-    <w:bookmarkStart w:id="173" w:name="ref-lee2023superconductor"/>
+    <w:bookmarkEnd w:id="172"/>
+    <w:bookmarkStart w:id="174" w:name="ref-lee2023superconductor"/>
     <w:p>
       <w:pPr>
         <w:pStyle w:val="Bibliography"/>
@@ -16439,7 +16459,7 @@
       <w:r>
         <w:t xml:space="preserve"> </w:t>
       </w:r>
-      <w:hyperlink r:id="rId172">
+      <w:hyperlink r:id="rId173">
         <w:r>
           <w:rPr>
             <w:rStyle w:val="Hyperlink"/>
@@ -16451,8 +16471,8 @@
         <w:t xml:space="preserve">.</w:t>
       </w:r>
     </w:p>
-    <w:bookmarkEnd w:id="173"/>
-    <w:bookmarkStart w:id="175" w:name="ref-lee2023lk99"/>
+    <w:bookmarkEnd w:id="174"/>
+    <w:bookmarkStart w:id="176" w:name="ref-lee2023lk99"/>
     <w:p>
       <w:pPr>
         <w:pStyle w:val="Bibliography"/>
@@ -16476,7 +16496,7 @@
       <w:r>
         <w:t xml:space="preserve"> </w:t>
       </w:r>
-      <w:hyperlink r:id="rId174">
+      <w:hyperlink r:id="rId175">
         <w:r>
           <w:rPr>
             <w:rStyle w:val="Hyperlink"/>
@@ -16488,8 +16508,8 @@
         <w:t xml:space="preserve">.</w:t>
       </w:r>
     </w:p>
-    <w:bookmarkEnd w:id="175"/>
-    <w:bookmarkStart w:id="177" w:name="ref-leeman2024challenges"/>
+    <w:bookmarkEnd w:id="176"/>
+    <w:bookmarkStart w:id="178" w:name="ref-leeman2024challenges"/>
     <w:p>
       <w:pPr>
         <w:pStyle w:val="Bibliography"/>
@@ -16522,7 +16542,7 @@
       <w:r>
         <w:t xml:space="preserve"> </w:t>
       </w:r>
-      <w:hyperlink r:id="rId176">
+      <w:hyperlink r:id="rId177">
         <w:r>
           <w:rPr>
             <w:rStyle w:val="Hyperlink"/>
@@ -16534,8 +16554,8 @@
         <w:t xml:space="preserve">.</w:t>
       </w:r>
     </w:p>
-    <w:bookmarkEnd w:id="177"/>
-    <w:bookmarkStart w:id="179" w:name="ref-li2019superconductivity"/>
+    <w:bookmarkEnd w:id="178"/>
+    <w:bookmarkStart w:id="180" w:name="ref-li2019superconductivity"/>
     <w:p>
       <w:pPr>
         <w:pStyle w:val="Bibliography"/>
@@ -16568,7 +16588,7 @@
       <w:r>
         <w:t xml:space="preserve"> </w:t>
       </w:r>
-      <w:hyperlink r:id="rId178">
+      <w:hyperlink r:id="rId179">
         <w:r>
           <w:rPr>
             <w:rStyle w:val="Hyperlink"/>
@@ -16580,8 +16600,8 @@
         <w:t xml:space="preserve">.</w:t>
       </w:r>
     </w:p>
-    <w:bookmarkEnd w:id="179"/>
-    <w:bookmarkStart w:id="181" w:name="ref-li2025bulk"/>
+    <w:bookmarkEnd w:id="180"/>
+    <w:bookmarkStart w:id="182" w:name="ref-li2025bulk"/>
     <w:p>
       <w:pPr>
         <w:pStyle w:val="Bibliography"/>
@@ -16611,7 +16631,7 @@
       <w:r>
         <w:t xml:space="preserve"> </w:t>
       </w:r>
-      <w:hyperlink r:id="rId180">
+      <w:hyperlink r:id="rId181">
         <w:r>
           <w:rPr>
             <w:rStyle w:val="Hyperlink"/>
@@ -16623,8 +16643,8 @@
         <w:t xml:space="preserve">.</w:t>
       </w:r>
     </w:p>
-    <w:bookmarkEnd w:id="181"/>
-    <w:bookmarkStart w:id="183" w:name="ref-li2026agentic"/>
+    <w:bookmarkEnd w:id="182"/>
+    <w:bookmarkStart w:id="184" w:name="ref-li2026agentic"/>
     <w:p>
       <w:pPr>
         <w:pStyle w:val="Bibliography"/>
@@ -16648,7 +16668,7 @@
       <w:r>
         <w:t xml:space="preserve"> </w:t>
       </w:r>
-      <w:hyperlink r:id="rId182">
+      <w:hyperlink r:id="rId183">
         <w:r>
           <w:rPr>
             <w:rStyle w:val="Hyperlink"/>
@@ -16660,8 +16680,8 @@
         <w:t xml:space="preserve">.</w:t>
       </w:r>
     </w:p>
-    <w:bookmarkEnd w:id="183"/>
-    <w:bookmarkStart w:id="185" w:name="ref-lotfizadeh2023superconducting"/>
+    <w:bookmarkEnd w:id="184"/>
+    <w:bookmarkStart w:id="186" w:name="ref-lotfizadeh2023superconducting"/>
     <w:p>
       <w:pPr>
         <w:pStyle w:val="Bibliography"/>
@@ -16700,7 +16720,7 @@
       <w:r>
         <w:t xml:space="preserve"> </w:t>
       </w:r>
-      <w:hyperlink r:id="rId184">
+      <w:hyperlink r:id="rId185">
         <w:r>
           <w:rPr>
             <w:rStyle w:val="Hyperlink"/>
@@ -16712,8 +16732,8 @@
         <w:t xml:space="preserve">.</w:t>
       </w:r>
     </w:p>
-    <w:bookmarkEnd w:id="185"/>
-    <w:bookmarkStart w:id="187" w:name="ref-luo2023bilayer"/>
+    <w:bookmarkEnd w:id="186"/>
+    <w:bookmarkStart w:id="188" w:name="ref-luo2023bilayer"/>
     <w:p>
       <w:pPr>
         <w:pStyle w:val="Bibliography"/>
@@ -16743,7 +16763,7 @@
       <w:r>
         <w:t xml:space="preserve"> </w:t>
       </w:r>
-      <w:hyperlink r:id="rId186">
+      <w:hyperlink r:id="rId187">
         <w:r>
           <w:rPr>
             <w:rStyle w:val="Hyperlink"/>
@@ -16755,8 +16775,8 @@
         <w:t xml:space="preserve">.</w:t>
       </w:r>
     </w:p>
-    <w:bookmarkEnd w:id="187"/>
-    <w:bookmarkStart w:id="189" w:name="ref-mazin2022notes"/>
+    <w:bookmarkEnd w:id="188"/>
+    <w:bookmarkStart w:id="190" w:name="ref-mazin2022notes"/>
     <w:p>
       <w:pPr>
         <w:pStyle w:val="Bibliography"/>
@@ -16786,7 +16806,7 @@
       <w:r>
         <w:t xml:space="preserve"> </w:t>
       </w:r>
-      <w:hyperlink r:id="rId188">
+      <w:hyperlink r:id="rId189">
         <w:r>
           <w:rPr>
             <w:rStyle w:val="Hyperlink"/>
@@ -16798,8 +16818,8 @@
         <w:t xml:space="preserve">.</w:t>
       </w:r>
     </w:p>
-    <w:bookmarkEnd w:id="189"/>
-    <w:bookmarkStart w:id="191" w:name="ref-mazur2022gate"/>
+    <w:bookmarkEnd w:id="190"/>
+    <w:bookmarkStart w:id="192" w:name="ref-mazur2022gate"/>
     <w:p>
       <w:pPr>
         <w:pStyle w:val="Bibliography"/>
@@ -16823,7 +16843,7 @@
       <w:r>
         <w:t xml:space="preserve"> </w:t>
       </w:r>
-      <w:hyperlink r:id="rId190">
+      <w:hyperlink r:id="rId191">
         <w:r>
           <w:rPr>
             <w:rStyle w:val="Hyperlink"/>
@@ -16835,8 +16855,8 @@
         <w:t xml:space="preserve">.</w:t>
       </w:r>
     </w:p>
-    <w:bookmarkEnd w:id="191"/>
-    <w:bookmarkStart w:id="193" w:name="ref-merchant2023scaling"/>
+    <w:bookmarkEnd w:id="192"/>
+    <w:bookmarkStart w:id="194" w:name="ref-merchant2023scaling"/>
     <w:p>
       <w:pPr>
         <w:pStyle w:val="Bibliography"/>
@@ -16869,7 +16889,7 @@
       <w:r>
         <w:t xml:space="preserve"> </w:t>
       </w:r>
-      <w:hyperlink r:id="rId192">
+      <w:hyperlink r:id="rId193">
         <w:r>
           <w:rPr>
             <w:rStyle w:val="Hyperlink"/>
@@ -16881,8 +16901,8 @@
         <w:t xml:space="preserve">.</w:t>
       </w:r>
     </w:p>
-    <w:bookmarkEnd w:id="193"/>
-    <w:bookmarkStart w:id="195" w:name="ref-miao2026prlbench"/>
+    <w:bookmarkEnd w:id="194"/>
+    <w:bookmarkStart w:id="196" w:name="ref-miao2026prlbench"/>
     <w:p>
       <w:pPr>
         <w:pStyle w:val="Bibliography"/>
@@ -16934,7 +16954,7 @@
       <w:r>
         <w:t xml:space="preserve"> </w:t>
       </w:r>
-      <w:hyperlink r:id="rId194">
+      <w:hyperlink r:id="rId195">
         <w:r>
           <w:rPr>
             <w:rStyle w:val="Hyperlink"/>
@@ -16946,8 +16966,8 @@
         <w:t xml:space="preserve">.</w:t>
       </w:r>
     </w:p>
-    <w:bookmarkEnd w:id="195"/>
-    <w:bookmarkStart w:id="197" w:name="ref-mohseni2024build"/>
+    <w:bookmarkEnd w:id="196"/>
+    <w:bookmarkStart w:id="198" w:name="ref-mohseni2024build"/>
     <w:p>
       <w:pPr>
         <w:pStyle w:val="Bibliography"/>
@@ -16971,7 +16991,7 @@
       <w:r>
         <w:t xml:space="preserve"> </w:t>
       </w:r>
-      <w:hyperlink r:id="rId196">
+      <w:hyperlink r:id="rId197">
         <w:r>
           <w:rPr>
             <w:rStyle w:val="Hyperlink"/>
@@ -16983,8 +17003,8 @@
         <w:t xml:space="preserve">.</w:t>
       </w:r>
     </w:p>
-    <w:bookmarkEnd w:id="197"/>
-    <w:bookmarkStart w:id="199" w:name="ref-nadeem2023superconducting"/>
+    <w:bookmarkEnd w:id="198"/>
+    <w:bookmarkStart w:id="200" w:name="ref-nadeem2023superconducting"/>
     <w:p>
       <w:pPr>
         <w:pStyle w:val="Bibliography"/>
@@ -17008,7 +17028,7 @@
       <w:r>
         <w:t xml:space="preserve"> </w:t>
       </w:r>
-      <w:hyperlink r:id="rId198">
+      <w:hyperlink r:id="rId199">
         <w:r>
           <w:rPr>
             <w:rStyle w:val="Hyperlink"/>
@@ -17020,8 +17040,8 @@
         <w:t xml:space="preserve">.</w:t>
       </w:r>
     </w:p>
-    <w:bookmarkEnd w:id="199"/>
-    <w:bookmarkStart w:id="201" w:name="ref-otting2026multi"/>
+    <w:bookmarkEnd w:id="200"/>
+    <w:bookmarkStart w:id="202" w:name="ref-otting2026multi"/>
     <w:p>
       <w:pPr>
         <w:pStyle w:val="Bibliography"/>
@@ -17045,7 +17065,7 @@
       <w:r>
         <w:t xml:space="preserve"> </w:t>
       </w:r>
-      <w:hyperlink r:id="rId200">
+      <w:hyperlink r:id="rId201">
         <w:r>
           <w:rPr>
             <w:rStyle w:val="Hyperlink"/>
@@ -17057,8 +17077,8 @@
         <w:t xml:space="preserve">.</w:t>
       </w:r>
     </w:p>
-    <w:bookmarkEnd w:id="201"/>
-    <w:bookmarkStart w:id="203" w:name="ref-ouyang2025high"/>
+    <w:bookmarkEnd w:id="202"/>
+    <w:bookmarkStart w:id="204" w:name="ref-ouyang2025high"/>
     <w:p>
       <w:pPr>
         <w:pStyle w:val="Bibliography"/>
@@ -17094,7 +17114,7 @@
       <w:r>
         <w:t xml:space="preserve"> </w:t>
       </w:r>
-      <w:hyperlink r:id="rId202">
+      <w:hyperlink r:id="rId203">
         <w:r>
           <w:rPr>
             <w:rStyle w:val="Hyperlink"/>
@@ -17106,8 +17126,8 @@
         <w:t xml:space="preserve">.</w:t>
       </w:r>
     </w:p>
-    <w:bookmarkEnd w:id="203"/>
-    <w:bookmarkStart w:id="205" w:name="ref-peng2024flat"/>
+    <w:bookmarkEnd w:id="204"/>
+    <w:bookmarkStart w:id="206" w:name="ref-peng2024flat"/>
     <w:p>
       <w:pPr>
         <w:pStyle w:val="Bibliography"/>
@@ -17146,7 +17166,7 @@
       <w:r>
         <w:t xml:space="preserve"> </w:t>
       </w:r>
-      <w:hyperlink r:id="rId204">
+      <w:hyperlink r:id="rId205">
         <w:r>
           <w:rPr>
             <w:rStyle w:val="Hyperlink"/>
@@ -17158,8 +17178,8 @@
         <w:t xml:space="preserve">.</w:t>
       </w:r>
     </w:p>
-    <w:bookmarkEnd w:id="205"/>
-    <w:bookmarkStart w:id="207" w:name="ref-pogue2022closed"/>
+    <w:bookmarkEnd w:id="206"/>
+    <w:bookmarkStart w:id="208" w:name="ref-pogue2022closed"/>
     <w:p>
       <w:pPr>
         <w:pStyle w:val="Bibliography"/>
@@ -17183,7 +17203,7 @@
       <w:r>
         <w:t xml:space="preserve"> </w:t>
       </w:r>
-      <w:hyperlink r:id="rId206">
+      <w:hyperlink r:id="rId207">
         <w:r>
           <w:rPr>
             <w:rStyle w:val="Hyperlink"/>
@@ -17195,8 +17215,8 @@
         <w:t xml:space="preserve">.</w:t>
       </w:r>
     </w:p>
-    <w:bookmarkEnd w:id="207"/>
-    <w:bookmarkStart w:id="209" w:name="ref-puphal2023single"/>
+    <w:bookmarkEnd w:id="208"/>
+    <w:bookmarkStart w:id="210" w:name="ref-puphal2023single"/>
     <w:p>
       <w:pPr>
         <w:pStyle w:val="Bibliography"/>
@@ -17248,7 +17268,7 @@
       <w:r>
         <w:t xml:space="preserve"> </w:t>
       </w:r>
-      <w:hyperlink r:id="rId208">
+      <w:hyperlink r:id="rId209">
         <w:r>
           <w:rPr>
             <w:rStyle w:val="Hyperlink"/>
@@ -17260,8 +17280,8 @@
         <w:t xml:space="preserve">.</w:t>
       </w:r>
     </w:p>
-    <w:bookmarkEnd w:id="209"/>
-    <w:bookmarkStart w:id="211" w:name="ref-ran2019nearly"/>
+    <w:bookmarkEnd w:id="210"/>
+    <w:bookmarkStart w:id="212" w:name="ref-ran2019nearly"/>
     <w:p>
       <w:pPr>
         <w:pStyle w:val="Bibliography"/>
@@ -17294,7 +17314,7 @@
       <w:r>
         <w:t xml:space="preserve"> </w:t>
       </w:r>
-      <w:hyperlink r:id="rId210">
+      <w:hyperlink r:id="rId211">
         <w:r>
           <w:rPr>
             <w:rStyle w:val="Hyperlink"/>
@@ -17306,8 +17326,8 @@
         <w:t xml:space="preserve">.</w:t>
       </w:r>
     </w:p>
-    <w:bookmarkEnd w:id="211"/>
-    <w:bookmarkStart w:id="213" w:name="ref-rende2026superconductivity"/>
+    <w:bookmarkEnd w:id="212"/>
+    <w:bookmarkStart w:id="214" w:name="ref-rende2026superconductivity"/>
     <w:p>
       <w:pPr>
         <w:pStyle w:val="Bibliography"/>
@@ -17331,7 +17351,7 @@
       <w:r>
         <w:t xml:space="preserve"> </w:t>
       </w:r>
-      <w:hyperlink r:id="rId212">
+      <w:hyperlink r:id="rId213">
         <w:r>
           <w:rPr>
             <w:rStyle w:val="Hyperlink"/>
@@ -17343,8 +17363,8 @@
         <w:t xml:space="preserve">.</w:t>
       </w:r>
     </w:p>
-    <w:bookmarkEnd w:id="213"/>
-    <w:bookmarkStart w:id="215" w:name="ref-roth2026large"/>
+    <w:bookmarkEnd w:id="214"/>
+    <w:bookmarkStart w:id="216" w:name="ref-roth2026large"/>
     <w:p>
       <w:pPr>
         <w:pStyle w:val="Bibliography"/>
@@ -17368,7 +17388,7 @@
       <w:r>
         <w:t xml:space="preserve"> </w:t>
       </w:r>
-      <w:hyperlink r:id="rId214">
+      <w:hyperlink r:id="rId215">
         <w:r>
           <w:rPr>
             <w:rStyle w:val="Hyperlink"/>
@@ -17380,8 +17400,8 @@
         <w:t xml:space="preserve">.</w:t>
       </w:r>
     </w:p>
-    <w:bookmarkEnd w:id="215"/>
-    <w:bookmarkStart w:id="217" w:name="ref-sakakibara2023possible"/>
+    <w:bookmarkEnd w:id="216"/>
+    <w:bookmarkStart w:id="218" w:name="ref-sakakibara2023possible"/>
     <w:p>
       <w:pPr>
         <w:pStyle w:val="Bibliography"/>
@@ -17411,7 +17431,7 @@
       <w:r>
         <w:t xml:space="preserve"> </w:t>
       </w:r>
-      <w:hyperlink r:id="rId216">
+      <w:hyperlink r:id="rId217">
         <w:r>
           <w:rPr>
             <w:rStyle w:val="Hyperlink"/>
@@ -17423,8 +17443,8 @@
         <w:t xml:space="preserve">.</w:t>
       </w:r>
     </w:p>
-    <w:bookmarkEnd w:id="217"/>
-    <w:bookmarkStart w:id="219" w:name="ref-salke2023evidence"/>
+    <w:bookmarkEnd w:id="218"/>
+    <w:bookmarkStart w:id="220" w:name="ref-salke2023evidence"/>
     <w:p>
       <w:pPr>
         <w:pStyle w:val="Bibliography"/>
@@ -17448,7 +17468,7 @@
       <w:r>
         <w:t xml:space="preserve"> </w:t>
       </w:r>
-      <w:hyperlink r:id="rId218">
+      <w:hyperlink r:id="rId219">
         <w:r>
           <w:rPr>
             <w:rStyle w:val="Hyperlink"/>
@@ -17460,8 +17480,8 @@
         <w:t xml:space="preserve">.</w:t>
       </w:r>
     </w:p>
-    <w:bookmarkEnd w:id="219"/>
-    <w:bookmarkStart w:id="221" w:name="ref-sanchez2023disordered"/>
+    <w:bookmarkEnd w:id="220"/>
+    <w:bookmarkStart w:id="222" w:name="ref-sanchez2023disordered"/>
     <w:p>
       <w:pPr>
         <w:pStyle w:val="Bibliography"/>
@@ -17513,7 +17533,7 @@
       <w:r>
         <w:t xml:space="preserve"> </w:t>
       </w:r>
-      <w:hyperlink r:id="rId220">
+      <w:hyperlink r:id="rId221">
         <w:r>
           <w:rPr>
             <w:rStyle w:val="Hyperlink"/>
@@ -17525,8 +17545,8 @@
         <w:t xml:space="preserve">.</w:t>
       </w:r>
     </w:p>
-    <w:bookmarkEnd w:id="221"/>
-    <w:bookmarkStart w:id="223" w:name="ref-sanna2023prediction"/>
+    <w:bookmarkEnd w:id="222"/>
+    <w:bookmarkStart w:id="224" w:name="ref-sanna2023prediction"/>
     <w:p>
       <w:pPr>
         <w:pStyle w:val="Bibliography"/>
@@ -17556,7 +17576,7 @@
       <w:r>
         <w:t xml:space="preserve"> </w:t>
       </w:r>
-      <w:hyperlink r:id="rId222">
+      <w:hyperlink r:id="rId223">
         <w:r>
           <w:rPr>
             <w:rStyle w:val="Hyperlink"/>
@@ -17568,8 +17588,8 @@
         <w:t xml:space="preserve">.</w:t>
       </w:r>
     </w:p>
-    <w:bookmarkEnd w:id="223"/>
-    <w:bookmarkStart w:id="225" w:name="ref-saykin2022high"/>
+    <w:bookmarkEnd w:id="224"/>
+    <w:bookmarkStart w:id="226" w:name="ref-saykin2022high"/>
     <w:p>
       <w:pPr>
         <w:pStyle w:val="Bibliography"/>
@@ -17614,7 +17634,7 @@
       <w:r>
         <w:t xml:space="preserve"> </w:t>
       </w:r>
-      <w:hyperlink r:id="rId224">
+      <w:hyperlink r:id="rId225">
         <w:r>
           <w:rPr>
             <w:rStyle w:val="Hyperlink"/>
@@ -17626,8 +17646,8 @@
         <w:t xml:space="preserve">.</w:t>
       </w:r>
     </w:p>
-    <w:bookmarkEnd w:id="225"/>
-    <w:bookmarkStart w:id="227" w:name="ref-schrade2026altermagnetic"/>
+    <w:bookmarkEnd w:id="226"/>
+    <w:bookmarkStart w:id="228" w:name="ref-schrade2026altermagnetic"/>
     <w:p>
       <w:pPr>
         <w:pStyle w:val="Bibliography"/>
@@ -17651,7 +17671,7 @@
       <w:r>
         <w:t xml:space="preserve"> </w:t>
       </w:r>
-      <w:hyperlink r:id="rId226">
+      <w:hyperlink r:id="rId227">
         <w:r>
           <w:rPr>
             <w:rStyle w:val="Hyperlink"/>
@@ -17663,8 +17683,8 @@
         <w:t xml:space="preserve">.</w:t>
       </w:r>
     </w:p>
-    <w:bookmarkEnd w:id="227"/>
-    <w:bookmarkStart w:id="229" w:name="ref-semenok2023evidence"/>
+    <w:bookmarkEnd w:id="228"/>
+    <w:bookmarkStart w:id="230" w:name="ref-semenok2023evidence"/>
     <w:p>
       <w:pPr>
         <w:pStyle w:val="Bibliography"/>
@@ -17744,7 +17764,7 @@
       <w:r>
         <w:t xml:space="preserve"> </w:t>
       </w:r>
-      <w:hyperlink r:id="rId228">
+      <w:hyperlink r:id="rId229">
         <w:r>
           <w:rPr>
             <w:rStyle w:val="Hyperlink"/>
@@ -17756,8 +17776,8 @@
         <w:t xml:space="preserve">.</w:t>
       </w:r>
     </w:p>
-    <w:bookmarkEnd w:id="229"/>
-    <w:bookmarkStart w:id="231" w:name="ref-shen2023effective"/>
+    <w:bookmarkEnd w:id="230"/>
+    <w:bookmarkStart w:id="232" w:name="ref-shen2023effective"/>
     <w:p>
       <w:pPr>
         <w:pStyle w:val="Bibliography"/>
@@ -17805,7 +17825,7 @@
       <w:r>
         <w:t xml:space="preserve"> </w:t>
       </w:r>
-      <w:hyperlink r:id="rId230">
+      <w:hyperlink r:id="rId231">
         <w:r>
           <w:rPr>
             <w:rStyle w:val="Hyperlink"/>
@@ -17817,8 +17837,8 @@
         <w:t xml:space="preserve">.</w:t>
       </w:r>
     </w:p>
-    <w:bookmarkEnd w:id="231"/>
-    <w:bookmarkStart w:id="233" w:name="ref-snider2020retracted"/>
+    <w:bookmarkEnd w:id="232"/>
+    <w:bookmarkStart w:id="234" w:name="ref-snider2020retracted"/>
     <w:p>
       <w:pPr>
         <w:pStyle w:val="Bibliography"/>
@@ -17851,7 +17871,7 @@
       <w:r>
         <w:t xml:space="preserve"> </w:t>
       </w:r>
-      <w:hyperlink r:id="rId232">
+      <w:hyperlink r:id="rId233">
         <w:r>
           <w:rPr>
             <w:rStyle w:val="Hyperlink"/>
@@ -17863,8 +17883,8 @@
         <w:t xml:space="preserve">.</w:t>
       </w:r>
     </w:p>
-    <w:bookmarkEnd w:id="233"/>
-    <w:bookmarkStart w:id="235" w:name="ref-somayazulu2019evidence"/>
+    <w:bookmarkEnd w:id="234"/>
+    <w:bookmarkStart w:id="236" w:name="ref-somayazulu2019evidence"/>
     <w:p>
       <w:pPr>
         <w:pStyle w:val="Bibliography"/>
@@ -17909,7 +17929,7 @@
       <w:r>
         <w:t xml:space="preserve"> </w:t>
       </w:r>
-      <w:hyperlink r:id="rId234">
+      <w:hyperlink r:id="rId235">
         <w:r>
           <w:rPr>
             <w:rStyle w:val="Hyperlink"/>
@@ -17921,8 +17941,8 @@
         <w:t xml:space="preserve">.</w:t>
       </w:r>
     </w:p>
-    <w:bookmarkEnd w:id="235"/>
-    <w:bookmarkStart w:id="237" w:name="ref-sommer20223dsc"/>
+    <w:bookmarkEnd w:id="236"/>
+    <w:bookmarkStart w:id="238" w:name="ref-sommer20223dsc"/>
     <w:p>
       <w:pPr>
         <w:pStyle w:val="Bibliography"/>
@@ -17946,7 +17966,7 @@
       <w:r>
         <w:t xml:space="preserve"> </w:t>
       </w:r>
-      <w:hyperlink r:id="rId236">
+      <w:hyperlink r:id="rId237">
         <w:r>
           <w:rPr>
             <w:rStyle w:val="Hyperlink"/>
@@ -17958,8 +17978,8 @@
         <w:t xml:space="preserve">.</w:t>
       </w:r>
     </w:p>
-    <w:bookmarkEnd w:id="237"/>
-    <w:bookmarkStart w:id="239" w:name="ref-song2025room"/>
+    <w:bookmarkEnd w:id="238"/>
+    <w:bookmarkStart w:id="240" w:name="ref-song2025room"/>
     <w:p>
       <w:pPr>
         <w:pStyle w:val="Bibliography"/>
@@ -17983,7 +18003,7 @@
       <w:r>
         <w:t xml:space="preserve"> </w:t>
       </w:r>
-      <w:hyperlink r:id="rId238">
+      <w:hyperlink r:id="rId239">
         <w:r>
           <w:rPr>
             <w:rStyle w:val="Hyperlink"/>
@@ -17995,8 +18015,8 @@
         <w:t xml:space="preserve">.</w:t>
       </w:r>
     </w:p>
-    <w:bookmarkEnd w:id="239"/>
-    <w:bookmarkStart w:id="241" w:name="ref-stanev2018machine"/>
+    <w:bookmarkEnd w:id="240"/>
+    <w:bookmarkStart w:id="242" w:name="ref-stanev2018machine"/>
     <w:p>
       <w:pPr>
         <w:pStyle w:val="Bibliography"/>
@@ -18029,7 +18049,7 @@
       <w:r>
         <w:t xml:space="preserve"> </w:t>
       </w:r>
-      <w:hyperlink r:id="rId240">
+      <w:hyperlink r:id="rId241">
         <w:r>
           <w:rPr>
             <w:rStyle w:val="Hyperlink"/>
@@ -18041,8 +18061,8 @@
         <w:t xml:space="preserve">.</w:t>
       </w:r>
     </w:p>
-    <w:bookmarkEnd w:id="241"/>
-    <w:bookmarkStart w:id="243" w:name="ref-sun2023superconductivity"/>
+    <w:bookmarkEnd w:id="242"/>
+    <w:bookmarkStart w:id="244" w:name="ref-sun2023superconductivity"/>
     <w:p>
       <w:pPr>
         <w:pStyle w:val="Bibliography"/>
@@ -18087,7 +18107,7 @@
       <w:r>
         <w:t xml:space="preserve"> </w:t>
       </w:r>
-      <w:hyperlink r:id="rId242">
+      <w:hyperlink r:id="rId243">
         <w:r>
           <w:rPr>
             <w:rStyle w:val="Hyperlink"/>
@@ -18099,8 +18119,8 @@
         <w:t xml:space="preserve">.</w:t>
       </w:r>
     </w:p>
-    <w:bookmarkEnd w:id="243"/>
-    <w:bookmarkStart w:id="245" w:name="ref-szymanski2023autonomous"/>
+    <w:bookmarkEnd w:id="244"/>
+    <w:bookmarkStart w:id="246" w:name="ref-szymanski2023autonomous"/>
     <w:p>
       <w:pPr>
         <w:pStyle w:val="Bibliography"/>
@@ -18133,7 +18153,7 @@
       <w:r>
         <w:t xml:space="preserve"> </w:t>
       </w:r>
-      <w:hyperlink r:id="rId244">
+      <w:hyperlink r:id="rId245">
         <w:r>
           <w:rPr>
             <w:rStyle w:val="Hyperlink"/>
@@ -18145,8 +18165,8 @@
         <w:t xml:space="preserve">.</w:t>
       </w:r>
     </w:p>
-    <w:bookmarkEnd w:id="245"/>
-    <w:bookmarkStart w:id="247" w:name="ref-tallon2024flux"/>
+    <w:bookmarkEnd w:id="246"/>
+    <w:bookmarkStart w:id="248" w:name="ref-tallon2024flux"/>
     <w:p>
       <w:pPr>
         <w:pStyle w:val="Bibliography"/>
@@ -18170,7 +18190,7 @@
       <w:r>
         <w:t xml:space="preserve"> </w:t>
       </w:r>
-      <w:hyperlink r:id="rId246">
+      <w:hyperlink r:id="rId247">
         <w:r>
           <w:rPr>
             <w:rStyle w:val="Hyperlink"/>
@@ -18182,8 +18202,8 @@
         <w:t xml:space="preserve">.</w:t>
       </w:r>
     </w:p>
-    <w:bookmarkEnd w:id="247"/>
-    <w:bookmarkStart w:id="249" w:name="ref-taranto2022unsupervised"/>
+    <w:bookmarkEnd w:id="248"/>
+    <w:bookmarkStart w:id="250" w:name="ref-taranto2022unsupervised"/>
     <w:p>
       <w:pPr>
         <w:pStyle w:val="Bibliography"/>
@@ -18235,7 +18255,7 @@
       <w:r>
         <w:t xml:space="preserve"> </w:t>
       </w:r>
-      <w:hyperlink r:id="rId248">
+      <w:hyperlink r:id="rId249">
         <w:r>
           <w:rPr>
             <w:rStyle w:val="Hyperlink"/>
@@ -18247,8 +18267,8 @@
         <w:t xml:space="preserve">.</w:t>
       </w:r>
     </w:p>
-    <w:bookmarkEnd w:id="249"/>
-    <w:bookmarkStart w:id="251" w:name="ref-thorngren2023higgs"/>
+    <w:bookmarkEnd w:id="250"/>
+    <w:bookmarkStart w:id="252" w:name="ref-thorngren2023higgs"/>
     <w:p>
       <w:pPr>
         <w:pStyle w:val="Bibliography"/>
@@ -18293,7 +18313,7 @@
       <w:r>
         <w:t xml:space="preserve"> </w:t>
       </w:r>
-      <w:hyperlink r:id="rId250">
+      <w:hyperlink r:id="rId251">
         <w:r>
           <w:rPr>
             <w:rStyle w:val="Hyperlink"/>
@@ -18305,8 +18325,8 @@
         <w:t xml:space="preserve">.</w:t>
       </w:r>
     </w:p>
-    <w:bookmarkEnd w:id="251"/>
-    <w:bookmarkStart w:id="253" w:name="ref-tran2025superconductor"/>
+    <w:bookmarkEnd w:id="252"/>
+    <w:bookmarkStart w:id="254" w:name="ref-tran2025superconductor"/>
     <w:p>
       <w:pPr>
         <w:pStyle w:val="Bibliography"/>
@@ -18336,7 +18356,7 @@
       <w:r>
         <w:t xml:space="preserve"> </w:t>
       </w:r>
-      <w:hyperlink r:id="rId252">
+      <w:hyperlink r:id="rId253">
         <w:r>
           <w:rPr>
             <w:rStyle w:val="Hyperlink"/>
@@ -18348,8 +18368,8 @@
         <w:t xml:space="preserve">.</w:t>
       </w:r>
     </w:p>
-    <w:bookmarkEnd w:id="253"/>
-    <w:bookmarkStart w:id="255" w:name="ref-tsintzis2023roadmap"/>
+    <w:bookmarkEnd w:id="254"/>
+    <w:bookmarkStart w:id="256" w:name="ref-tsintzis2023roadmap"/>
     <w:p>
       <w:pPr>
         <w:pStyle w:val="Bibliography"/>
@@ -18379,7 +18399,7 @@
       <w:r>
         <w:t xml:space="preserve"> </w:t>
       </w:r>
-      <w:hyperlink r:id="rId254">
+      <w:hyperlink r:id="rId255">
         <w:r>
           <w:rPr>
             <w:rStyle w:val="Hyperlink"/>
@@ -18391,8 +18411,8 @@
         <w:t xml:space="preserve">.</w:t>
       </w:r>
     </w:p>
-    <w:bookmarkEnd w:id="255"/>
-    <w:bookmarkStart w:id="257" w:name="ref-verresen2022higgs"/>
+    <w:bookmarkEnd w:id="256"/>
+    <w:bookmarkStart w:id="258" w:name="ref-verresen2022higgs"/>
     <w:p>
       <w:pPr>
         <w:pStyle w:val="Bibliography"/>
@@ -18416,7 +18436,7 @@
       <w:r>
         <w:t xml:space="preserve"> </w:t>
       </w:r>
-      <w:hyperlink r:id="rId256">
+      <w:hyperlink r:id="rId257">
         <w:r>
           <w:rPr>
             <w:rStyle w:val="Hyperlink"/>
@@ -18428,8 +18448,8 @@
         <w:t xml:space="preserve">.</w:t>
       </w:r>
     </w:p>
-    <w:bookmarkEnd w:id="257"/>
-    <w:bookmarkStart w:id="259" w:name="ref-vora2024ml"/>
+    <w:bookmarkEnd w:id="258"/>
+    <w:bookmarkStart w:id="260" w:name="ref-vora2024ml"/>
     <w:p>
       <w:pPr>
         <w:pStyle w:val="Bibliography"/>
@@ -18481,7 +18501,7 @@
       <w:r>
         <w:t xml:space="preserve"> </w:t>
       </w:r>
-      <w:hyperlink r:id="rId258">
+      <w:hyperlink r:id="rId259">
         <w:r>
           <w:rPr>
             <w:rStyle w:val="Hyperlink"/>
@@ -18493,8 +18513,8 @@
         <w:t xml:space="preserve">.</w:t>
       </w:r>
     </w:p>
-    <w:bookmarkEnd w:id="259"/>
-    <w:bookmarkStart w:id="261" w:name="ref-wang2022symmetry"/>
+    <w:bookmarkEnd w:id="260"/>
+    <w:bookmarkStart w:id="262" w:name="ref-wang2022symmetry"/>
     <w:p>
       <w:pPr>
         <w:pStyle w:val="Bibliography"/>
@@ -18518,7 +18538,7 @@
       <w:r>
         <w:t xml:space="preserve"> </w:t>
       </w:r>
-      <w:hyperlink r:id="rId260">
+      <w:hyperlink r:id="rId261">
         <w:r>
           <w:rPr>
             <w:rStyle w:val="Hyperlink"/>
@@ -18530,8 +18550,8 @@
         <w:t xml:space="preserve">.</w:t>
       </w:r>
     </w:p>
-    <w:bookmarkEnd w:id="261"/>
-    <w:bookmarkStart w:id="263" w:name="ref-wang2023pressurea"/>
+    <w:bookmarkEnd w:id="262"/>
+    <w:bookmarkStart w:id="264" w:name="ref-wang2023pressurea"/>
     <w:p>
       <w:pPr>
         <w:pStyle w:val="Bibliography"/>
@@ -18570,7 +18590,7 @@
       <w:r>
         <w:t xml:space="preserve"> </w:t>
       </w:r>
-      <w:hyperlink r:id="rId262">
+      <w:hyperlink r:id="rId263">
         <w:r>
           <w:rPr>
             <w:rStyle w:val="Hyperlink"/>
@@ -18582,8 +18602,8 @@
         <w:t xml:space="preserve">.</w:t>
       </w:r>
     </w:p>
-    <w:bookmarkEnd w:id="263"/>
-    <w:bookmarkStart w:id="265" w:name="ref-wang2025discoverya"/>
+    <w:bookmarkEnd w:id="264"/>
+    <w:bookmarkStart w:id="266" w:name="ref-wang2025discoverya"/>
     <w:p>
       <w:pPr>
         <w:pStyle w:val="Bibliography"/>
@@ -18607,7 +18627,7 @@
       <w:r>
         <w:t xml:space="preserve"> </w:t>
       </w:r>
-      <w:hyperlink r:id="rId264">
+      <w:hyperlink r:id="rId265">
         <w:r>
           <w:rPr>
             <w:rStyle w:val="Hyperlink"/>
@@ -18619,8 +18639,8 @@
         <w:t xml:space="preserve">.</w:t>
       </w:r>
     </w:p>
-    <w:bookmarkEnd w:id="265"/>
-    <w:bookmarkStart w:id="267" w:name="ref-wang2026naturebench"/>
+    <w:bookmarkEnd w:id="266"/>
+    <w:bookmarkStart w:id="268" w:name="ref-wang2026naturebench"/>
     <w:p>
       <w:pPr>
         <w:pStyle w:val="Bibliography"/>
@@ -18697,7 +18717,7 @@
       <w:r>
         <w:t xml:space="preserve"> </w:t>
       </w:r>
-      <w:hyperlink r:id="rId266">
+      <w:hyperlink r:id="rId267">
         <w:r>
           <w:rPr>
             <w:rStyle w:val="Hyperlink"/>
@@ -18709,8 +18729,8 @@
         <w:t xml:space="preserve">.</w:t>
       </w:r>
     </w:p>
-    <w:bookmarkEnd w:id="267"/>
-    <w:bookmarkStart w:id="269" w:name="ref-wang2025recent"/>
+    <w:bookmarkEnd w:id="268"/>
+    <w:bookmarkStart w:id="270" w:name="ref-wang2025recent"/>
     <w:p>
       <w:pPr>
         <w:pStyle w:val="Bibliography"/>
@@ -18740,7 +18760,7 @@
       <w:r>
         <w:t xml:space="preserve"> </w:t>
       </w:r>
-      <w:hyperlink r:id="rId268">
+      <w:hyperlink r:id="rId269">
         <w:r>
           <w:rPr>
             <w:rStyle w:val="Hyperlink"/>
@@ -18752,8 +18772,8 @@
         <w:t xml:space="preserve">.</w:t>
       </w:r>
     </w:p>
-    <w:bookmarkEnd w:id="269"/>
-    <w:bookmarkStart w:id="271" w:name="ref-wines2023recent"/>
+    <w:bookmarkEnd w:id="270"/>
+    <w:bookmarkStart w:id="272" w:name="ref-wines2023recent"/>
     <w:p>
       <w:pPr>
         <w:pStyle w:val="Bibliography"/>
@@ -18795,7 +18815,7 @@
       <w:r>
         <w:t xml:space="preserve"> </w:t>
       </w:r>
-      <w:hyperlink r:id="rId270">
+      <w:hyperlink r:id="rId271">
         <w:r>
           <w:rPr>
             <w:rStyle w:val="Hyperlink"/>
@@ -18807,8 +18827,8 @@
         <w:t xml:space="preserve">.</w:t>
       </w:r>
     </w:p>
-    <w:bookmarkEnd w:id="271"/>
-    <w:bookmarkStart w:id="273" w:name="ref-wu2023enhanced"/>
+    <w:bookmarkEnd w:id="272"/>
+    <w:bookmarkStart w:id="274" w:name="ref-wu2023enhanced"/>
     <w:p>
       <w:pPr>
         <w:pStyle w:val="Bibliography"/>
@@ -18847,7 +18867,7 @@
       <w:r>
         <w:t xml:space="preserve"> </w:t>
       </w:r>
-      <w:hyperlink r:id="rId272">
+      <w:hyperlink r:id="rId273">
         <w:r>
           <w:rPr>
             <w:rStyle w:val="Hyperlink"/>
@@ -18859,8 +18879,8 @@
         <w:t xml:space="preserve">.</w:t>
       </w:r>
     </w:p>
-    <w:bookmarkEnd w:id="273"/>
-    <w:bookmarkStart w:id="275" w:name="ref-xu2023altermagnetic"/>
+    <w:bookmarkEnd w:id="274"/>
+    <w:bookmarkStart w:id="276" w:name="ref-xu2023altermagnetic"/>
     <w:p>
       <w:pPr>
         <w:pStyle w:val="Bibliography"/>
@@ -18899,7 +18919,7 @@
       <w:r>
         <w:t xml:space="preserve"> </w:t>
       </w:r>
-      <w:hyperlink r:id="rId274">
+      <w:hyperlink r:id="rId275">
         <w:r>
           <w:rPr>
             <w:rStyle w:val="Hyperlink"/>
@@ -18911,8 +18931,8 @@
         <w:t xml:space="preserve">.</w:t>
       </w:r>
     </w:p>
-    <w:bookmarkEnd w:id="275"/>
-    <w:bookmarkStart w:id="277" w:name="ref-xu2023coexistence"/>
+    <w:bookmarkEnd w:id="276"/>
+    <w:bookmarkStart w:id="278" w:name="ref-xu2023coexistence"/>
     <w:p>
       <w:pPr>
         <w:pStyle w:val="Bibliography"/>
@@ -18942,7 +18962,7 @@
       <w:r>
         <w:t xml:space="preserve"> </w:t>
       </w:r>
-      <w:hyperlink r:id="rId276">
+      <w:hyperlink r:id="rId277">
         <w:r>
           <w:rPr>
             <w:rStyle w:val="Hyperlink"/>
@@ -18954,8 +18974,8 @@
         <w:t xml:space="preserve">.</w:t>
       </w:r>
     </w:p>
-    <w:bookmarkEnd w:id="277"/>
-    <w:bookmarkStart w:id="279" w:name="ref-yang2022superconductivitya"/>
+    <w:bookmarkEnd w:id="278"/>
+    <w:bookmarkStart w:id="280" w:name="ref-yang2022superconductivitya"/>
     <w:p>
       <w:pPr>
         <w:pStyle w:val="Bibliography"/>
@@ -18994,7 +19014,7 @@
       <w:r>
         <w:t xml:space="preserve"> </w:t>
       </w:r>
-      <w:hyperlink r:id="rId278">
+      <w:hyperlink r:id="rId279">
         <w:r>
           <w:rPr>
             <w:rStyle w:val="Hyperlink"/>
@@ -19006,8 +19026,8 @@
         <w:t xml:space="preserve">.</w:t>
       </w:r>
     </w:p>
-    <w:bookmarkEnd w:id="279"/>
-    <w:bookmarkStart w:id="281" w:name="ref-yu2023nontrivial"/>
+    <w:bookmarkEnd w:id="280"/>
+    <w:bookmarkStart w:id="282" w:name="ref-yu2023nontrivial"/>
     <w:p>
       <w:pPr>
         <w:pStyle w:val="Bibliography"/>
@@ -19037,7 +19057,7 @@
       <w:r>
         <w:t xml:space="preserve"> </w:t>
       </w:r>
-      <w:hyperlink r:id="rId280">
+      <w:hyperlink r:id="rId281">
         <w:r>
           <w:rPr>
             <w:rStyle w:val="Hyperlink"/>
@@ -19049,8 +19069,8 @@
         <w:t xml:space="preserve">.</w:t>
       </w:r>
     </w:p>
-    <w:bookmarkEnd w:id="281"/>
-    <w:bookmarkStart w:id="283" w:name="ref-zhang2023high"/>
+    <w:bookmarkEnd w:id="282"/>
+    <w:bookmarkStart w:id="284" w:name="ref-zhang2023high"/>
     <w:p>
       <w:pPr>
         <w:pStyle w:val="Bibliography"/>
@@ -19103,7 +19123,7 @@
       <w:r>
         <w:t xml:space="preserve"> </w:t>
       </w:r>
-      <w:hyperlink r:id="rId282">
+      <w:hyperlink r:id="rId283">
         <w:r>
           <w:rPr>
             <w:rStyle w:val="Hyperlink"/>
@@ -19115,8 +19135,8 @@
         <w:t xml:space="preserve">.</w:t>
       </w:r>
     </w:p>
-    <w:bookmarkEnd w:id="283"/>
-    <w:bookmarkStart w:id="285" w:name="ref-zhang2026superconductivity"/>
+    <w:bookmarkEnd w:id="284"/>
+    <w:bookmarkStart w:id="286" w:name="ref-zhang2026superconductivity"/>
     <w:p>
       <w:pPr>
         <w:pStyle w:val="Bibliography"/>
@@ -19140,7 +19160,7 @@
       <w:r>
         <w:t xml:space="preserve"> </w:t>
       </w:r>
-      <w:hyperlink r:id="rId284">
+      <w:hyperlink r:id="rId285">
         <w:r>
           <w:rPr>
             <w:rStyle w:val="Hyperlink"/>
@@ -19152,8 +19172,8 @@
         <w:t xml:space="preserve">.</w:t>
       </w:r>
     </w:p>
-    <w:bookmarkEnd w:id="285"/>
-    <w:bookmarkStart w:id="287" w:name="ref-zhou2024ambient"/>
+    <w:bookmarkEnd w:id="286"/>
+    <w:bookmarkStart w:id="288" w:name="ref-zhou2024ambient"/>
     <w:p>
       <w:pPr>
         <w:pStyle w:val="Bibliography"/>
@@ -19183,7 +19203,7 @@
       <w:r>
         <w:t xml:space="preserve"> </w:t>
       </w:r>
-      <w:hyperlink r:id="rId286">
+      <w:hyperlink r:id="rId287">
         <w:r>
           <w:rPr>
             <w:rStyle w:val="Hyperlink"/>
@@ -19195,8 +19215,8 @@
         <w:t xml:space="preserve">.</w:t>
       </w:r>
     </w:p>
-    <w:bookmarkEnd w:id="287"/>
-    <w:bookmarkStart w:id="289" w:name="ref-zhou2025superconductivity"/>
+    <w:bookmarkEnd w:id="288"/>
+    <w:bookmarkStart w:id="290" w:name="ref-zhou2025superconductivity"/>
     <w:p>
       <w:pPr>
         <w:pStyle w:val="Bibliography"/>
@@ -19226,7 +19246,7 @@
       <w:r>
         <w:t xml:space="preserve"> </w:t>
       </w:r>
-      <w:hyperlink r:id="rId288">
+      <w:hyperlink r:id="rId289">
         <w:r>
           <w:rPr>
             <w:rStyle w:val="Hyperlink"/>
@@ -19238,8 +19258,8 @@
         <w:t xml:space="preserve">.</w:t>
       </w:r>
     </w:p>
-    <w:bookmarkEnd w:id="289"/>
-    <w:bookmarkStart w:id="291" w:name="ref-zhou2023investigations"/>
+    <w:bookmarkEnd w:id="290"/>
+    <w:bookmarkStart w:id="292" w:name="ref-zhou2023investigations"/>
     <w:p>
       <w:pPr>
         <w:pStyle w:val="Bibliography"/>
@@ -19278,7 +19298,7 @@
       <w:r>
         <w:t xml:space="preserve"> </w:t>
       </w:r>
-      <w:hyperlink r:id="rId290">
+      <w:hyperlink r:id="rId291">
         <w:r>
           <w:rPr>
             <w:rStyle w:val="Hyperlink"/>
@@ -19290,9 +19310,9 @@
         <w:t xml:space="preserve">.</w:t>
       </w:r>
     </w:p>
-    <w:bookmarkEnd w:id="291"/>
     <w:bookmarkEnd w:id="292"/>
     <w:bookmarkEnd w:id="293"/>
+    <w:bookmarkEnd w:id="294"/>
     <w:sectPr>
       <w:footnotePr>
         <w:numRestart w:val="eachSect"/>

</xml_diff>